<commit_message>
IJOC version: lead with the method, cost analysis and cached implementation; add algorithm and complexity
Co-Authored-By: Claude Sonnet 5.5 <noreply@anthropic.com>
Claude-Session: https://claude.ai/code/session_01CmDdfYCJkX1v32uwdfkXMf
</commit_message>
<xml_diff>
--- a/manuscript/ijoc_manuscript.docx
+++ b/manuscript/ijoc_manuscript.docx
@@ -483,7 +483,7 @@
         <w:t xml:space="preserve"> </w:t>
       </w:r>
       <w:r>
-        <w:t xml:space="preserve">formulate</w:t>
+        <w:t xml:space="preserve">study</w:t>
       </w:r>
       <w:r>
         <w:t xml:space="preserve"> </w:t>
@@ -495,13 +495,793 @@
         <w:t xml:space="preserve"> </w:t>
       </w:r>
       <w:r>
-        <w:t xml:space="preserve">problem</w:t>
-      </w:r>
-      <w:r>
-        <w:t xml:space="preserve"> </w:t>
-      </w:r>
-      <w:r>
-        <w:t xml:space="preserve">as</w:t>
+        <w:t xml:space="preserve">decision</w:t>
+      </w:r>
+      <w:r>
+        <w:t xml:space="preserve"> </w:t>
+      </w:r>
+      <w:r>
+        <w:t xml:space="preserve">from</w:t>
+      </w:r>
+      <w:r>
+        <w:t xml:space="preserve"> </w:t>
+      </w:r>
+      <w:r>
+        <w:t xml:space="preserve">a</w:t>
+      </w:r>
+      <w:r>
+        <w:t xml:space="preserve"> </w:t>
+      </w:r>
+      <w:r>
+        <w:t xml:space="preserve">computational</w:t>
+      </w:r>
+      <w:r>
+        <w:t xml:space="preserve"> </w:t>
+      </w:r>
+      <w:r>
+        <w:t xml:space="preserve">angle.</w:t>
+      </w:r>
+      <w:r>
+        <w:t xml:space="preserve"> </w:t>
+      </w:r>
+      <w:r>
+        <w:t xml:space="preserve">We</w:t>
+      </w:r>
+      <w:r>
+        <w:t xml:space="preserve"> </w:t>
+      </w:r>
+      <w:r>
+        <w:t xml:space="preserve">propose</w:t>
+      </w:r>
+      <w:r>
+        <w:t xml:space="preserve"> </w:t>
+      </w:r>
+      <w:r>
+        <w:t xml:space="preserve">Anchored</w:t>
+      </w:r>
+      <w:r>
+        <w:t xml:space="preserve"> </w:t>
+      </w:r>
+      <w:r>
+        <w:t xml:space="preserve">Calibration</w:t>
+      </w:r>
+      <w:r>
+        <w:t xml:space="preserve"> </w:t>
+      </w:r>
+      <w:r>
+        <w:t xml:space="preserve">Transfer</w:t>
+      </w:r>
+      <w:r>
+        <w:t xml:space="preserve"> </w:t>
+      </w:r>
+      <w:r>
+        <w:t xml:space="preserve">(ACT),</w:t>
+      </w:r>
+      <w:r>
+        <w:t xml:space="preserve"> </w:t>
+      </w:r>
+      <w:r>
+        <w:t xml:space="preserve">a</w:t>
+      </w:r>
+      <w:r>
+        <w:t xml:space="preserve"> </w:t>
+      </w:r>
+      <w:r>
+        <w:t xml:space="preserve">closed-form,</w:t>
+      </w:r>
+      <w:r>
+        <w:t xml:space="preserve"> </w:t>
+      </w:r>
+      <w:r>
+        <w:t xml:space="preserve">label-free</w:t>
+      </w:r>
+      <w:r>
+        <w:t xml:space="preserve"> </w:t>
+      </w:r>
+      <w:r>
+        <w:t xml:space="preserve">correction</w:t>
+      </w:r>
+      <w:r>
+        <w:t xml:space="preserve"> </w:t>
+      </w:r>
+      <w:r>
+        <w:t xml:space="preserve">of</w:t>
+      </w:r>
+      <w:r>
+        <w:t xml:space="preserve"> </w:t>
+      </w:r>
+      <w:r>
+        <w:t xml:space="preserve">a</w:t>
+      </w:r>
+      <w:r>
+        <w:t xml:space="preserve"> </w:t>
+      </w:r>
+      <w:r>
+        <w:t xml:space="preserve">low-rank</w:t>
+      </w:r>
+      <w:r>
+        <w:t xml:space="preserve"> </w:t>
+      </w:r>
+      <w:r>
+        <w:t xml:space="preserve">adapter</w:t>
+      </w:r>
+      <w:r>
+        <w:t xml:space="preserve"> </w:t>
+      </w:r>
+      <w:r>
+        <w:t xml:space="preserve">that</w:t>
+      </w:r>
+      <w:r>
+        <w:t xml:space="preserve"> </w:t>
+      </w:r>
+      <w:r>
+        <w:t xml:space="preserve">needs</w:t>
+      </w:r>
+      <w:r>
+        <w:t xml:space="preserve"> </w:t>
+      </w:r>
+      <w:r>
+        <w:t xml:space="preserve">one</w:t>
+      </w:r>
+      <w:r>
+        <w:t xml:space="preserve"> </w:t>
+      </w:r>
+      <w:r>
+        <w:t xml:space="preserve">pass</w:t>
+      </w:r>
+      <w:r>
+        <w:t xml:space="preserve"> </w:t>
+      </w:r>
+      <w:r>
+        <w:t xml:space="preserve">over</w:t>
+      </w:r>
+      <w:r>
+        <w:t xml:space="preserve"> </w:t>
+      </w:r>
+      <w:r>
+        <w:t xml:space="preserve">unlabeled</w:t>
+      </w:r>
+      <w:r>
+        <w:t xml:space="preserve"> </w:t>
+      </w:r>
+      <w:r>
+        <w:t xml:space="preserve">task</w:t>
+      </w:r>
+      <w:r>
+        <w:t xml:space="preserve"> </w:t>
+      </w:r>
+      <w:r>
+        <w:t xml:space="preserve">inputs</w:t>
+      </w:r>
+      <w:r>
+        <w:t xml:space="preserve"> </w:t>
+      </w:r>
+      <w:r>
+        <w:t xml:space="preserve">and</w:t>
+      </w:r>
+      <w:r>
+        <w:t xml:space="preserve"> </w:t>
+      </w:r>
+      <w:r>
+        <w:t xml:space="preserve">a</w:t>
+      </w:r>
+      <w:r>
+        <w:t xml:space="preserve"> </w:t>
+      </w:r>
+      <w:r>
+        <w:t xml:space="preserve">set</w:t>
+      </w:r>
+      <w:r>
+        <w:t xml:space="preserve"> </w:t>
+      </w:r>
+      <w:r>
+        <w:t xml:space="preserve">of</w:t>
+      </w:r>
+      <w:r>
+        <w:t xml:space="preserve"> </w:t>
+      </w:r>
+      <w:r>
+        <w:t xml:space="preserve">ridge</w:t>
+      </w:r>
+      <w:r>
+        <w:t xml:space="preserve"> </w:t>
+      </w:r>
+      <w:r>
+        <w:t xml:space="preserve">solves,</w:t>
+      </w:r>
+      <w:r>
+        <w:t xml:space="preserve"> </w:t>
+      </w:r>
+      <w:r>
+        <w:t xml:space="preserve">and</w:t>
+      </w:r>
+      <w:r>
+        <w:t xml:space="preserve"> </w:t>
+      </w:r>
+      <w:r>
+        <w:t xml:space="preserve">we</w:t>
+      </w:r>
+      <w:r>
+        <w:t xml:space="preserve"> </w:t>
+      </w:r>
+      <w:r>
+        <w:t xml:space="preserve">show</w:t>
+      </w:r>
+      <w:r>
+        <w:t xml:space="preserve"> </w:t>
+      </w:r>
+      <w:r>
+        <w:t xml:space="preserve">that</w:t>
+      </w:r>
+      <w:r>
+        <w:t xml:space="preserve"> </w:t>
+      </w:r>
+      <w:r>
+        <w:t xml:space="preserve">a</w:t>
+      </w:r>
+      <w:r>
+        <w:t xml:space="preserve"> </w:t>
+      </w:r>
+      <w:r>
+        <w:t xml:space="preserve">straightforward</w:t>
+      </w:r>
+      <w:r>
+        <w:t xml:space="preserve"> </w:t>
+      </w:r>
+      <w:r>
+        <w:t xml:space="preserve">implementation</w:t>
+      </w:r>
+      <w:r>
+        <w:t xml:space="preserve"> </w:t>
+      </w:r>
+      <w:r>
+        <w:t xml:space="preserve">re-runs</w:t>
+      </w:r>
+      <w:r>
+        <w:t xml:space="preserve"> </w:t>
+      </w:r>
+      <w:r>
+        <w:t xml:space="preserve">the</w:t>
+      </w:r>
+      <w:r>
+        <w:t xml:space="preserve"> </w:t>
+      </w:r>
+      <w:r>
+        <w:t xml:space="preserve">network</w:t>
+      </w:r>
+      <w:r>
+        <w:t xml:space="preserve"> </w:t>
+      </w:r>
+      <w:r>
+        <w:t xml:space="preserve">once</w:t>
+      </w:r>
+      <w:r>
+        <w:t xml:space="preserve"> </w:t>
+      </w:r>
+      <w:r>
+        <w:t xml:space="preserve">for</w:t>
+      </w:r>
+      <w:r>
+        <w:t xml:space="preserve"> </w:t>
+      </w:r>
+      <w:r>
+        <w:t xml:space="preserve">every</w:t>
+      </w:r>
+      <w:r>
+        <w:t xml:space="preserve"> </w:t>
+      </w:r>
+      <w:r>
+        <w:t xml:space="preserve">layer,</w:t>
+      </w:r>
+      <w:r>
+        <w:t xml:space="preserve"> </w:t>
+      </w:r>
+      <w:r>
+        <w:t xml:space="preserve">so</w:t>
+      </w:r>
+      <w:r>
+        <w:t xml:space="preserve"> </w:t>
+      </w:r>
+      <w:r>
+        <w:t xml:space="preserve">that</w:t>
+      </w:r>
+      <w:r>
+        <w:t xml:space="preserve"> </w:t>
+      </w:r>
+      <w:r>
+        <w:t xml:space="preserve">its</w:t>
+      </w:r>
+      <w:r>
+        <w:t xml:space="preserve"> </w:t>
+      </w:r>
+      <w:r>
+        <w:t xml:space="preserve">cost</w:t>
+      </w:r>
+      <w:r>
+        <w:t xml:space="preserve"> </w:t>
+      </w:r>
+      <w:r>
+        <w:t xml:space="preserve">grows</w:t>
+      </w:r>
+      <w:r>
+        <w:t xml:space="preserve"> </w:t>
+      </w:r>
+      <w:r>
+        <w:t xml:space="preserve">with</w:t>
+      </w:r>
+      <w:r>
+        <w:t xml:space="preserve"> </w:t>
+      </w:r>
+      <w:r>
+        <w:t xml:space="preserve">the</w:t>
+      </w:r>
+      <w:r>
+        <w:t xml:space="preserve"> </w:t>
+      </w:r>
+      <w:r>
+        <w:t xml:space="preserve">square</w:t>
+      </w:r>
+      <w:r>
+        <w:t xml:space="preserve"> </w:t>
+      </w:r>
+      <w:r>
+        <w:t xml:space="preserve">of</w:t>
+      </w:r>
+      <w:r>
+        <w:t xml:space="preserve"> </w:t>
+      </w:r>
+      <w:r>
+        <w:t xml:space="preserve">the</w:t>
+      </w:r>
+      <w:r>
+        <w:t xml:space="preserve"> </w:t>
+      </w:r>
+      <w:r>
+        <w:t xml:space="preserve">depth.</w:t>
+      </w:r>
+      <w:r>
+        <w:t xml:space="preserve"> </w:t>
+      </w:r>
+      <w:r>
+        <w:t xml:space="preserve">Caching</w:t>
+      </w:r>
+      <w:r>
+        <w:t xml:space="preserve"> </w:t>
+      </w:r>
+      <w:r>
+        <w:t xml:space="preserve">layer</w:t>
+      </w:r>
+      <w:r>
+        <w:t xml:space="preserve"> </w:t>
+      </w:r>
+      <w:r>
+        <w:t xml:space="preserve">inputs</w:t>
+      </w:r>
+      <w:r>
+        <w:t xml:space="preserve"> </w:t>
+      </w:r>
+      <w:r>
+        <w:t xml:space="preserve">removes</w:t>
+      </w:r>
+      <w:r>
+        <w:t xml:space="preserve"> </w:t>
+      </w:r>
+      <w:r>
+        <w:t xml:space="preserve">this</w:t>
+      </w:r>
+      <w:r>
+        <w:t xml:space="preserve"> </w:t>
+      </w:r>
+      <w:r>
+        <w:t xml:space="preserve">repetition</w:t>
+      </w:r>
+      <w:r>
+        <w:t xml:space="preserve"> </w:t>
+      </w:r>
+      <w:r>
+        <w:t xml:space="preserve">without</w:t>
+      </w:r>
+      <w:r>
+        <w:t xml:space="preserve"> </w:t>
+      </w:r>
+      <w:r>
+        <w:t xml:space="preserve">changing</w:t>
+      </w:r>
+      <w:r>
+        <w:t xml:space="preserve"> </w:t>
+      </w:r>
+      <w:r>
+        <w:t xml:space="preserve">the</w:t>
+      </w:r>
+      <w:r>
+        <w:t xml:space="preserve"> </w:t>
+      </w:r>
+      <w:r>
+        <w:t xml:space="preserve">output:</w:t>
+      </w:r>
+      <w:r>
+        <w:t xml:space="preserve"> </w:t>
+      </w:r>
+      <w:r>
+        <w:t xml:space="preserve">on</w:t>
+      </w:r>
+      <w:r>
+        <w:t xml:space="preserve"> </w:t>
+      </w:r>
+      <w:r>
+        <w:t xml:space="preserve">the</w:t>
+      </w:r>
+      <w:r>
+        <w:t xml:space="preserve"> </w:t>
+      </w:r>
+      <w:r>
+        <w:t xml:space="preserve">same</w:t>
+      </w:r>
+      <w:r>
+        <w:t xml:space="preserve"> </w:t>
+      </w:r>
+      <w:r>
+        <w:t xml:space="preserve">trained</w:t>
+      </w:r>
+      <w:r>
+        <w:t xml:space="preserve"> </w:t>
+      </w:r>
+      <w:r>
+        <w:t xml:space="preserve">adapters</w:t>
+      </w:r>
+      <w:r>
+        <w:t xml:space="preserve"> </w:t>
+      </w:r>
+      <w:r>
+        <w:t xml:space="preserve">the</w:t>
+      </w:r>
+      <w:r>
+        <w:t xml:space="preserve"> </w:t>
+      </w:r>
+      <w:r>
+        <w:t xml:space="preserve">two</w:t>
+      </w:r>
+      <w:r>
+        <w:t xml:space="preserve"> </w:t>
+      </w:r>
+      <w:r>
+        <w:t xml:space="preserve">implementations</w:t>
+      </w:r>
+      <w:r>
+        <w:t xml:space="preserve"> </w:t>
+      </w:r>
+      <w:r>
+        <w:t xml:space="preserve">select</w:t>
+      </w:r>
+      <w:r>
+        <w:t xml:space="preserve"> </w:t>
+      </w:r>
+      <w:r>
+        <w:t xml:space="preserve">identical</w:t>
+      </w:r>
+      <w:r>
+        <w:t xml:space="preserve"> </w:t>
+      </w:r>
+      <w:r>
+        <w:t xml:space="preserve">anchoring</w:t>
+      </w:r>
+      <w:r>
+        <w:t xml:space="preserve"> </w:t>
+      </w:r>
+      <w:r>
+        <w:t xml:space="preserve">strengths</w:t>
+      </w:r>
+      <w:r>
+        <w:t xml:space="preserve"> </w:t>
+      </w:r>
+      <w:r>
+        <w:t xml:space="preserve">and</w:t>
+      </w:r>
+      <w:r>
+        <w:t xml:space="preserve"> </w:t>
+      </w:r>
+      <w:r>
+        <w:t xml:space="preserve">give</w:t>
+      </w:r>
+      <w:r>
+        <w:t xml:space="preserve"> </w:t>
+      </w:r>
+      <w:r>
+        <w:t xml:space="preserve">identical</w:t>
+      </w:r>
+      <w:r>
+        <w:t xml:space="preserve"> </w:t>
+      </w:r>
+      <w:r>
+        <w:t xml:space="preserve">held-out</w:t>
+      </w:r>
+      <w:r>
+        <w:t xml:space="preserve"> </w:t>
+      </w:r>
+      <w:r>
+        <w:t xml:space="preserve">loss,</w:t>
+      </w:r>
+      <w:r>
+        <w:t xml:space="preserve"> </w:t>
+      </w:r>
+      <w:r>
+        <w:t xml:space="preserve">and</w:t>
+      </w:r>
+      <w:r>
+        <w:t xml:space="preserve"> </w:t>
+      </w:r>
+      <w:r>
+        <w:t xml:space="preserve">the</w:t>
+      </w:r>
+      <w:r>
+        <w:t xml:space="preserve"> </w:t>
+      </w:r>
+      <w:r>
+        <w:t xml:space="preserve">cached</w:t>
+      </w:r>
+      <w:r>
+        <w:t xml:space="preserve"> </w:t>
+      </w:r>
+      <w:r>
+        <w:t xml:space="preserve">version</w:t>
+      </w:r>
+      <w:r>
+        <w:t xml:space="preserve"> </w:t>
+      </w:r>
+      <w:r>
+        <w:t xml:space="preserve">is</w:t>
+      </w:r>
+      <w:r>
+        <w:t xml:space="preserve"> </w:t>
+      </w:r>
+      <w:r>
+        <w:t xml:space="preserve">1.4</w:t>
+      </w:r>
+      <w:r>
+        <w:t xml:space="preserve"> </w:t>
+      </w:r>
+      <w:r>
+        <w:t xml:space="preserve">to</w:t>
+      </w:r>
+      <w:r>
+        <w:t xml:space="preserve"> </w:t>
+      </w:r>
+      <w:r>
+        <w:t xml:space="preserve">2.4</w:t>
+      </w:r>
+      <w:r>
+        <w:t xml:space="preserve"> </w:t>
+      </w:r>
+      <w:r>
+        <w:t xml:space="preserve">times</w:t>
+      </w:r>
+      <w:r>
+        <w:t xml:space="preserve"> </w:t>
+      </w:r>
+      <w:r>
+        <w:t xml:space="preserve">faster</w:t>
+      </w:r>
+      <w:r>
+        <w:t xml:space="preserve"> </w:t>
+      </w:r>
+      <w:r>
+        <w:t xml:space="preserve">at</w:t>
+      </w:r>
+      <w:r>
+        <w:t xml:space="preserve"> </w:t>
+      </w:r>
+      <w:r>
+        <w:t xml:space="preserve">70</w:t>
+      </w:r>
+      <w:r>
+        <w:t xml:space="preserve"> </w:t>
+      </w:r>
+      <w:r>
+        <w:t xml:space="preserve">to</w:t>
+      </w:r>
+      <w:r>
+        <w:t xml:space="preserve"> </w:t>
+      </w:r>
+      <w:r>
+        <w:t xml:space="preserve">410</w:t>
+      </w:r>
+      <w:r>
+        <w:t xml:space="preserve"> </w:t>
+      </w:r>
+      <w:r>
+        <w:t xml:space="preserve">million</w:t>
+      </w:r>
+      <w:r>
+        <w:t xml:space="preserve"> </w:t>
+      </w:r>
+      <w:r>
+        <w:t xml:space="preserve">parameters,</w:t>
+      </w:r>
+      <w:r>
+        <w:t xml:space="preserve"> </w:t>
+      </w:r>
+      <w:r>
+        <w:t xml:space="preserve">which</w:t>
+      </w:r>
+      <w:r>
+        <w:t xml:space="preserve"> </w:t>
+      </w:r>
+      <w:r>
+        <w:t xml:space="preserve">lowers</w:t>
+      </w:r>
+      <w:r>
+        <w:t xml:space="preserve"> </w:t>
+      </w:r>
+      <w:r>
+        <w:t xml:space="preserve">ACT’s</w:t>
+      </w:r>
+      <w:r>
+        <w:t xml:space="preserve"> </w:t>
+      </w:r>
+      <w:r>
+        <w:t xml:space="preserve">compute</w:t>
+      </w:r>
+      <w:r>
+        <w:t xml:space="preserve"> </w:t>
+      </w:r>
+      <w:r>
+        <w:t xml:space="preserve">time</w:t>
+      </w:r>
+      <w:r>
+        <w:t xml:space="preserve"> </w:t>
+      </w:r>
+      <w:r>
+        <w:t xml:space="preserve">relative</w:t>
+      </w:r>
+      <w:r>
+        <w:t xml:space="preserve"> </w:t>
+      </w:r>
+      <w:r>
+        <w:t xml:space="preserve">to</w:t>
+      </w:r>
+      <w:r>
+        <w:t xml:space="preserve"> </w:t>
+      </w:r>
+      <w:r>
+        <w:t xml:space="preserve">retraining</w:t>
+      </w:r>
+      <w:r>
+        <w:t xml:space="preserve"> </w:t>
+      </w:r>
+      <w:r>
+        <w:t xml:space="preserve">at</w:t>
+      </w:r>
+      <w:r>
+        <w:t xml:space="preserve"> </w:t>
+      </w:r>
+      <w:r>
+        <w:t xml:space="preserve">410</w:t>
+      </w:r>
+      <w:r>
+        <w:t xml:space="preserve"> </w:t>
+      </w:r>
+      <w:r>
+        <w:t xml:space="preserve">million</w:t>
+      </w:r>
+      <w:r>
+        <w:t xml:space="preserve"> </w:t>
+      </w:r>
+      <w:r>
+        <w:t xml:space="preserve">parameters</w:t>
+      </w:r>
+      <w:r>
+        <w:t xml:space="preserve"> </w:t>
+      </w:r>
+      <w:r>
+        <w:t xml:space="preserve">from</w:t>
+      </w:r>
+      <w:r>
+        <w:t xml:space="preserve"> </w:t>
+      </w:r>
+      <w:r>
+        <w:t xml:space="preserve">0.67</w:t>
+      </w:r>
+      <w:r>
+        <w:t xml:space="preserve"> </w:t>
+      </w:r>
+      <w:r>
+        <w:t xml:space="preserve">to</w:t>
+      </w:r>
+      <w:r>
+        <w:t xml:space="preserve"> </w:t>
+      </w:r>
+      <w:r>
+        <w:t xml:space="preserve">0.28.</w:t>
+      </w:r>
+      <w:r>
+        <w:t xml:space="preserve"> </w:t>
+      </w:r>
+      <w:r>
+        <w:t xml:space="preserve">To</w:t>
+      </w:r>
+      <w:r>
+        <w:t xml:space="preserve"> </w:t>
+      </w:r>
+      <w:r>
+        <w:t xml:space="preserve">judge</w:t>
+      </w:r>
+      <w:r>
+        <w:t xml:space="preserve"> </w:t>
+      </w:r>
+      <w:r>
+        <w:t xml:space="preserve">when</w:t>
+      </w:r>
+      <w:r>
+        <w:t xml:space="preserve"> </w:t>
+      </w:r>
+      <w:r>
+        <w:t xml:space="preserve">such</w:t>
+      </w:r>
+      <w:r>
+        <w:t xml:space="preserve"> </w:t>
+      </w:r>
+      <w:r>
+        <w:t xml:space="preserve">a</w:t>
+      </w:r>
+      <w:r>
+        <w:t xml:space="preserve"> </w:t>
+      </w:r>
+      <w:r>
+        <w:t xml:space="preserve">method</w:t>
+      </w:r>
+      <w:r>
+        <w:t xml:space="preserve"> </w:t>
+      </w:r>
+      <w:r>
+        <w:t xml:space="preserve">is</w:t>
+      </w:r>
+      <w:r>
+        <w:t xml:space="preserve"> </w:t>
+      </w:r>
+      <w:r>
+        <w:t xml:space="preserve">worth</w:t>
+      </w:r>
+      <w:r>
+        <w:t xml:space="preserve"> </w:t>
+      </w:r>
+      <w:r>
+        <w:t xml:space="preserve">its</w:t>
+      </w:r>
+      <w:r>
+        <w:t xml:space="preserve"> </w:t>
+      </w:r>
+      <w:r>
+        <w:t xml:space="preserve">cost,</w:t>
+      </w:r>
+      <w:r>
+        <w:t xml:space="preserve"> </w:t>
+      </w:r>
+      <w:r>
+        <w:t xml:space="preserve">we</w:t>
+      </w:r>
+      <w:r>
+        <w:t xml:space="preserve"> </w:t>
+      </w:r>
+      <w:r>
+        <w:t xml:space="preserve">embed</w:t>
+      </w:r>
+      <w:r>
+        <w:t xml:space="preserve"> </w:t>
+      </w:r>
+      <w:r>
+        <w:t xml:space="preserve">it</w:t>
+      </w:r>
+      <w:r>
+        <w:t xml:space="preserve"> </w:t>
+      </w:r>
+      <w:r>
+        <w:t xml:space="preserve">in</w:t>
+      </w:r>
+      <w:r>
+        <w:t xml:space="preserve"> </w:t>
+      </w:r>
+      <w:r>
+        <w:t xml:space="preserve">an</w:t>
       </w:r>
       <w:r>
         <w:t xml:space="preserve"> </w:t>
@@ -519,7 +1299,25 @@
         <w:t xml:space="preserve"> </w:t>
       </w:r>
       <w:r>
-        <w:t xml:space="preserve">in</w:t>
+        <w:t xml:space="preserve">model</w:t>
+      </w:r>
+      <w:r>
+        <w:t xml:space="preserve"> </w:t>
+      </w:r>
+      <w:r>
+        <w:t xml:space="preserve">with</w:t>
+      </w:r>
+      <w:r>
+        <w:t xml:space="preserve"> </w:t>
+      </w:r>
+      <w:r>
+        <w:t xml:space="preserve">stochastic</w:t>
+      </w:r>
+      <w:r>
+        <w:t xml:space="preserve"> </w:t>
+      </w:r>
+      <w:r>
+        <w:t xml:space="preserve">upgrades,</w:t>
       </w:r>
       <w:r>
         <w:t xml:space="preserve"> </w:t>
@@ -531,55 +1329,361 @@
         <w:t xml:space="preserve"> </w:t>
       </w:r>
       <w:r>
+        <w:t xml:space="preserve">gives</w:t>
+      </w:r>
+      <w:r>
+        <w:t xml:space="preserve"> </w:t>
+      </w:r>
+      <w:r>
+        <w:t xml:space="preserve">a</w:t>
+      </w:r>
+      <w:r>
+        <w:t xml:space="preserve"> </w:t>
+      </w:r>
+      <w:r>
+        <w:t xml:space="preserve">closed-form</w:t>
+      </w:r>
+      <w:r>
+        <w:t xml:space="preserve"> </w:t>
+      </w:r>
+      <w:r>
+        <w:t xml:space="preserve">retraining</w:t>
+      </w:r>
+      <w:r>
+        <w:t xml:space="preserve"> </w:t>
+      </w:r>
+      <w:r>
+        <w:t xml:space="preserve">threshold</w:t>
+      </w:r>
+      <w:r>
+        <w:t xml:space="preserve"> </w:t>
+      </w:r>
+      <w:r>
+        <w:t xml:space="preserve">and</w:t>
+      </w:r>
+      <w:r>
+        <w:t xml:space="preserve"> </w:t>
+      </w:r>
+      <w:r>
+        <w:t xml:space="preserve">a</w:t>
+      </w:r>
+      <w:r>
+        <w:t xml:space="preserve"> </w:t>
+      </w:r>
+      <w:r>
+        <w:t xml:space="preserve">break-even</w:t>
+      </w:r>
+      <w:r>
+        <w:t xml:space="preserve"> </w:t>
+      </w:r>
+      <w:r>
+        <w:t xml:space="preserve">recovery.</w:t>
+      </w:r>
+      <w:r>
+        <w:t xml:space="preserve"> </w:t>
+      </w:r>
+      <w:r>
+        <w:t xml:space="preserve">On</w:t>
+      </w:r>
+      <w:r>
+        <w:t xml:space="preserve"> </w:t>
+      </w:r>
+      <w:r>
+        <w:t xml:space="preserve">open</w:t>
+      </w:r>
+      <w:r>
+        <w:t xml:space="preserve"> </w:t>
+      </w:r>
+      <w:r>
+        <w:t xml:space="preserve">model</w:t>
+      </w:r>
+      <w:r>
+        <w:t xml:space="preserve"> </w:t>
+      </w:r>
+      <w:r>
+        <w:t xml:space="preserve">pairs,</w:t>
+      </w:r>
+      <w:r>
+        <w:t xml:space="preserve"> </w:t>
+      </w:r>
+      <w:r>
+        <w:t xml:space="preserve">copying</w:t>
+      </w:r>
+      <w:r>
+        <w:t xml:space="preserve"> </w:t>
+      </w:r>
+      <w:r>
+        <w:t xml:space="preserve">the</w:t>
+      </w:r>
+      <w:r>
+        <w:t xml:space="preserve"> </w:t>
+      </w:r>
+      <w:r>
+        <w:t xml:space="preserve">old</w:t>
+      </w:r>
+      <w:r>
+        <w:t xml:space="preserve"> </w:t>
+      </w:r>
+      <w:r>
+        <w:t xml:space="preserve">adapter</w:t>
+      </w:r>
+      <w:r>
+        <w:t xml:space="preserve"> </w:t>
+      </w:r>
+      <w:r>
+        <w:t xml:space="preserve">restores</w:t>
+      </w:r>
+      <w:r>
+        <w:t xml:space="preserve"> </w:t>
+      </w:r>
+      <w:r>
+        <w:t xml:space="preserve">96</w:t>
+      </w:r>
+      <w:r>
+        <w:t xml:space="preserve"> </w:t>
+      </w:r>
+      <w:r>
+        <w:t xml:space="preserve">percent</w:t>
+      </w:r>
+      <w:r>
+        <w:t xml:space="preserve"> </w:t>
+      </w:r>
+      <w:r>
+        <w:t xml:space="preserve">of</w:t>
+      </w:r>
+      <w:r>
+        <w:t xml:space="preserve"> </w:t>
+      </w:r>
+      <w:r>
+        <w:t xml:space="preserve">the</w:t>
+      </w:r>
+      <w:r>
+        <w:t xml:space="preserve"> </w:t>
+      </w:r>
+      <w:r>
+        <w:t xml:space="preserve">retraining</w:t>
+      </w:r>
+      <w:r>
+        <w:t xml:space="preserve"> </w:t>
+      </w:r>
+      <w:r>
+        <w:t xml:space="preserve">benefit</w:t>
+      </w:r>
+      <w:r>
+        <w:t xml:space="preserve"> </w:t>
+      </w:r>
+      <w:r>
+        <w:t xml:space="preserve">after</w:t>
+      </w:r>
+      <w:r>
+        <w:t xml:space="preserve"> </w:t>
+      </w:r>
+      <w:r>
+        <w:t xml:space="preserve">a</w:t>
+      </w:r>
+      <w:r>
+        <w:t xml:space="preserve"> </w:t>
+      </w:r>
+      <w:r>
+        <w:t xml:space="preserve">small</w:t>
+      </w:r>
+      <w:r>
+        <w:t xml:space="preserve"> </w:t>
+      </w:r>
+      <w:r>
+        <w:t xml:space="preserve">upgrade</w:t>
+      </w:r>
+      <w:r>
+        <w:t xml:space="preserve"> </w:t>
+      </w:r>
+      <w:r>
+        <w:t xml:space="preserve">but</w:t>
+      </w:r>
+      <w:r>
+        <w:t xml:space="preserve"> </w:t>
+      </w:r>
+      <w:r>
+        <w:t xml:space="preserve">only</w:t>
+      </w:r>
+      <w:r>
+        <w:t xml:space="preserve"> </w:t>
+      </w:r>
+      <w:r>
+        <w:t xml:space="preserve">32</w:t>
+      </w:r>
+      <w:r>
+        <w:t xml:space="preserve"> </w:t>
+      </w:r>
+      <w:r>
+        <w:t xml:space="preserve">to</w:t>
+      </w:r>
+      <w:r>
+        <w:t xml:space="preserve"> </w:t>
+      </w:r>
+      <w:r>
+        <w:t xml:space="preserve">36</w:t>
+      </w:r>
+      <w:r>
+        <w:t xml:space="preserve"> </w:t>
+      </w:r>
+      <w:r>
+        <w:t xml:space="preserve">percent</w:t>
+      </w:r>
+      <w:r>
+        <w:t xml:space="preserve"> </w:t>
+      </w:r>
+      <w:r>
+        <w:t xml:space="preserve">after</w:t>
+      </w:r>
+      <w:r>
+        <w:t xml:space="preserve"> </w:t>
+      </w:r>
+      <w:r>
+        <w:t xml:space="preserve">the</w:t>
+      </w:r>
+      <w:r>
+        <w:t xml:space="preserve"> </w:t>
+      </w:r>
+      <w:r>
+        <w:t xml:space="preserve">largest.</w:t>
+      </w:r>
+      <w:r>
+        <w:t xml:space="preserve"> </w:t>
+      </w:r>
+      <w:r>
+        <w:t xml:space="preserve">ACT’s</w:t>
+      </w:r>
+      <w:r>
+        <w:t xml:space="preserve"> </w:t>
+      </w:r>
+      <w:r>
+        <w:t xml:space="preserve">gain</w:t>
+      </w:r>
+      <w:r>
+        <w:t xml:space="preserve"> </w:t>
+      </w:r>
+      <w:r>
+        <w:t xml:space="preserve">over</w:t>
+      </w:r>
+      <w:r>
+        <w:t xml:space="preserve"> </w:t>
+      </w:r>
+      <w:r>
+        <w:t xml:space="preserve">copying</w:t>
+      </w:r>
+      <w:r>
+        <w:t xml:space="preserve"> </w:t>
+      </w:r>
+      <w:r>
+        <w:t xml:space="preserve">rises</w:t>
+      </w:r>
+      <w:r>
+        <w:t xml:space="preserve"> </w:t>
+      </w:r>
+      <w:r>
+        <w:t xml:space="preserve">steadily</w:t>
+      </w:r>
+      <w:r>
+        <w:t xml:space="preserve"> </w:t>
+      </w:r>
+      <w:r>
+        <w:t xml:space="preserve">with</w:t>
+      </w:r>
+      <w:r>
+        <w:t xml:space="preserve"> </w:t>
+      </w:r>
+      <w:r>
+        <w:t xml:space="preserve">the</w:t>
+      </w:r>
+      <w:r>
+        <w:t xml:space="preserve"> </w:t>
+      </w:r>
+      <w:r>
+        <w:t xml:space="preserve">size</w:t>
+      </w:r>
+      <w:r>
+        <w:t xml:space="preserve"> </w:t>
+      </w:r>
+      <w:r>
+        <w:t xml:space="preserve">of</w:t>
+      </w:r>
+      <w:r>
+        <w:t xml:space="preserve"> </w:t>
+      </w:r>
+      <w:r>
+        <w:t xml:space="preserve">the</w:t>
+      </w:r>
+      <w:r>
+        <w:t xml:space="preserve"> </w:t>
+      </w:r>
+      <w:r>
+        <w:t xml:space="preserve">upgrade,</w:t>
+      </w:r>
+      <w:r>
+        <w:t xml:space="preserve"> </w:t>
+      </w:r>
+      <w:r>
+        <w:t xml:space="preserve">and</w:t>
+      </w:r>
+      <w:r>
+        <w:t xml:space="preserve"> </w:t>
+      </w:r>
+      <w:r>
+        <w:t xml:space="preserve">it</w:t>
+      </w:r>
+      <w:r>
+        <w:t xml:space="preserve"> </w:t>
+      </w:r>
+      <w:r>
+        <w:t xml:space="preserve">pays</w:t>
+      </w:r>
+      <w:r>
+        <w:t xml:space="preserve"> </w:t>
+      </w:r>
+      <w:r>
+        <w:t xml:space="preserve">for</w:t>
+      </w:r>
+      <w:r>
+        <w:t xml:space="preserve"> </w:t>
+      </w:r>
+      <w:r>
+        <w:t xml:space="preserve">itself</w:t>
+      </w:r>
+      <w:r>
+        <w:t xml:space="preserve"> </w:t>
+      </w:r>
+      <w:r>
+        <w:t xml:space="preserve">after</w:t>
+      </w:r>
+      <w:r>
+        <w:t xml:space="preserve"> </w:t>
+      </w:r>
+      <w:r>
+        <w:t xml:space="preserve">sufficiently</w:t>
+      </w:r>
+      <w:r>
+        <w:t xml:space="preserve"> </w:t>
+      </w:r>
+      <w:r>
+        <w:t xml:space="preserve">large</w:t>
+      </w:r>
+      <w:r>
+        <w:t xml:space="preserve"> </w:t>
+      </w:r>
+      <w:r>
         <w:t xml:space="preserve">upgrades</w:t>
       </w:r>
       <w:r>
         <w:t xml:space="preserve"> </w:t>
       </w:r>
       <w:r>
-        <w:t xml:space="preserve">arrive</w:t>
-      </w:r>
-      <w:r>
-        <w:t xml:space="preserve"> </w:t>
-      </w:r>
-      <w:r>
-        <w:t xml:space="preserve">stochastically,</w:t>
-      </w:r>
-      <w:r>
-        <w:t xml:space="preserve"> </w:t>
-      </w:r>
-      <w:r>
-        <w:t xml:space="preserve">the</w:t>
-      </w:r>
-      <w:r>
-        <w:t xml:space="preserve"> </w:t>
-      </w:r>
-      <w:r>
-        <w:t xml:space="preserve">value</w:t>
-      </w:r>
-      <w:r>
-        <w:t xml:space="preserve"> </w:t>
-      </w:r>
-      <w:r>
         <w:t xml:space="preserve">at</w:t>
       </w:r>
       <w:r>
         <w:t xml:space="preserve"> </w:t>
       </w:r>
       <w:r>
-        <w:t xml:space="preserve">stake</w:t>
-      </w:r>
-      <w:r>
-        <w:t xml:space="preserve"> </w:t>
-      </w:r>
-      <w:r>
-        <w:t xml:space="preserve">evolves</w:t>
-      </w:r>
-      <w:r>
-        <w:t xml:space="preserve"> </w:t>
-      </w:r>
-      <w:r>
-        <w:t xml:space="preserve">randomly,</w:t>
+        <w:t xml:space="preserve">70</w:t>
       </w:r>
       <w:r>
         <w:t xml:space="preserve"> </w:t>
@@ -591,19 +1695,157 @@
         <w:t xml:space="preserve"> </w:t>
       </w:r>
       <w:r>
+        <w:t xml:space="preserve">160</w:t>
+      </w:r>
+      <w:r>
+        <w:t xml:space="preserve"> </w:t>
+      </w:r>
+      <w:r>
+        <w:t xml:space="preserve">million</w:t>
+      </w:r>
+      <w:r>
+        <w:t xml:space="preserve"> </w:t>
+      </w:r>
+      <w:r>
+        <w:t xml:space="preserve">parameters</w:t>
+      </w:r>
+      <w:r>
+        <w:t xml:space="preserve"> </w:t>
+      </w:r>
+      <w:r>
+        <w:t xml:space="preserve">but</w:t>
+      </w:r>
+      <w:r>
+        <w:t xml:space="preserve"> </w:t>
+      </w:r>
+      <w:r>
+        <w:t xml:space="preserve">not</w:t>
+      </w:r>
+      <w:r>
+        <w:t xml:space="preserve"> </w:t>
+      </w:r>
+      <w:r>
+        <w:t xml:space="preserve">at</w:t>
+      </w:r>
+      <w:r>
+        <w:t xml:space="preserve"> </w:t>
+      </w:r>
+      <w:r>
+        <w:t xml:space="preserve">410</w:t>
+      </w:r>
+      <w:r>
+        <w:t xml:space="preserve"> </w:t>
+      </w:r>
+      <w:r>
+        <w:t xml:space="preserve">million.</w:t>
+      </w:r>
+      <w:r>
+        <w:t xml:space="preserve"> </w:t>
+      </w:r>
+      <w:r>
+        <w:t xml:space="preserve">On</w:t>
+      </w:r>
+      <w:r>
+        <w:t xml:space="preserve"> </w:t>
+      </w:r>
+      <w:r>
+        <w:t xml:space="preserve">an</w:t>
+      </w:r>
+      <w:r>
+        <w:t xml:space="preserve"> </w:t>
+      </w:r>
+      <w:r>
+        <w:t xml:space="preserve">instruction-tuned</w:t>
+      </w:r>
+      <w:r>
+        <w:t xml:space="preserve"> </w:t>
+      </w:r>
+      <w:r>
+        <w:t xml:space="preserve">pair</w:t>
+      </w:r>
+      <w:r>
+        <w:t xml:space="preserve"> </w:t>
+      </w:r>
+      <w:r>
+        <w:t xml:space="preserve">it</w:t>
+      </w:r>
+      <w:r>
+        <w:t xml:space="preserve"> </w:t>
+      </w:r>
+      <w:r>
+        <w:t xml:space="preserve">gives</w:t>
+      </w:r>
+      <w:r>
+        <w:t xml:space="preserve"> </w:t>
+      </w:r>
+      <w:r>
+        <w:t xml:space="preserve">no</w:t>
+      </w:r>
+      <w:r>
+        <w:t xml:space="preserve"> </w:t>
+      </w:r>
+      <w:r>
+        <w:t xml:space="preserve">gain,</w:t>
+      </w:r>
+      <w:r>
+        <w:t xml:space="preserve"> </w:t>
+      </w:r>
+      <w:r>
+        <w:t xml:space="preserve">for</w:t>
+      </w:r>
+      <w:r>
+        <w:t xml:space="preserve"> </w:t>
+      </w:r>
+      <w:r>
         <w:t xml:space="preserve">a</w:t>
       </w:r>
       <w:r>
         <w:t xml:space="preserve"> </w:t>
       </w:r>
       <w:r>
-        <w:t xml:space="preserve">transfer</w:t>
-      </w:r>
-      <w:r>
-        <w:t xml:space="preserve"> </w:t>
-      </w:r>
-      <w:r>
-        <w:t xml:space="preserve">method</w:t>
+        <w:t xml:space="preserve">reason</w:t>
+      </w:r>
+      <w:r>
+        <w:t xml:space="preserve"> </w:t>
+      </w:r>
+      <w:r>
+        <w:t xml:space="preserve">we</w:t>
+      </w:r>
+      <w:r>
+        <w:t xml:space="preserve"> </w:t>
+      </w:r>
+      <w:r>
+        <w:t xml:space="preserve">could</w:t>
+      </w:r>
+      <w:r>
+        <w:t xml:space="preserve"> </w:t>
+      </w:r>
+      <w:r>
+        <w:t xml:space="preserve">not</w:t>
+      </w:r>
+      <w:r>
+        <w:t xml:space="preserve"> </w:t>
+      </w:r>
+      <w:r>
+        <w:t xml:space="preserve">identify.</w:t>
+      </w:r>
+      <w:r>
+        <w:t xml:space="preserve"> </w:t>
+      </w:r>
+      <w:r>
+        <w:t xml:space="preserve">The</w:t>
+      </w:r>
+      <w:r>
+        <w:t xml:space="preserve"> </w:t>
+      </w:r>
+      <w:r>
+        <w:t xml:space="preserve">decision</w:t>
+      </w:r>
+      <w:r>
+        <w:t xml:space="preserve"> </w:t>
+      </w:r>
+      <w:r>
+        <w:t xml:space="preserve">rule</w:t>
       </w:r>
       <w:r>
         <w:t xml:space="preserve"> </w:t>
@@ -615,61 +1857,19 @@
         <w:t xml:space="preserve"> </w:t>
       </w:r>
       <w:r>
-        <w:t xml:space="preserve">characterized</w:t>
-      </w:r>
-      <w:r>
-        <w:t xml:space="preserve"> </w:t>
-      </w:r>
-      <w:r>
-        <w:t xml:space="preserve">by</w:t>
-      </w:r>
-      <w:r>
-        <w:t xml:space="preserve"> </w:t>
-      </w:r>
-      <w:r>
-        <w:t xml:space="preserve">the</w:t>
-      </w:r>
-      <w:r>
-        <w:t xml:space="preserve"> </w:t>
-      </w:r>
-      <w:r>
-        <w:t xml:space="preserve">share</w:t>
-      </w:r>
-      <w:r>
-        <w:t xml:space="preserve"> </w:t>
-      </w:r>
-      <w:r>
-        <w:t xml:space="preserve">of</w:t>
-      </w:r>
-      <w:r>
-        <w:t xml:space="preserve"> </w:t>
-      </w:r>
-      <w:r>
-        <w:t xml:space="preserve">the</w:t>
-      </w:r>
-      <w:r>
-        <w:t xml:space="preserve"> </w:t>
-      </w:r>
-      <w:r>
-        <w:t xml:space="preserve">retraining</w:t>
-      </w:r>
-      <w:r>
-        <w:t xml:space="preserve"> </w:t>
-      </w:r>
-      <w:r>
-        <w:t xml:space="preserve">benefit</w:t>
-      </w:r>
-      <w:r>
-        <w:t xml:space="preserve"> </w:t>
-      </w:r>
-      <w:r>
-        <w:t xml:space="preserve">it</w:t>
-      </w:r>
-      <w:r>
-        <w:t xml:space="preserve"> </w:t>
-      </w:r>
-      <w:r>
-        <w:t xml:space="preserve">recovers</w:t>
+        <w:t xml:space="preserve">robust</w:t>
+      </w:r>
+      <w:r>
+        <w:t xml:space="preserve"> </w:t>
+      </w:r>
+      <w:r>
+        <w:t xml:space="preserve">to</w:t>
+      </w:r>
+      <w:r>
+        <w:t xml:space="preserve"> </w:t>
+      </w:r>
+      <w:r>
+        <w:t xml:space="preserve">clustered</w:t>
       </w:r>
       <w:r>
         <w:t xml:space="preserve"> </w:t>
@@ -681,127 +1881,25 @@
         <w:t xml:space="preserve"> </w:t>
       </w:r>
       <w:r>
-        <w:t xml:space="preserve">by</w:t>
-      </w:r>
-      <w:r>
-        <w:t xml:space="preserve"> </w:t>
-      </w:r>
-      <w:r>
-        <w:t xml:space="preserve">its</w:t>
-      </w:r>
-      <w:r>
-        <w:t xml:space="preserve"> </w:t>
-      </w:r>
-      <w:r>
-        <w:t xml:space="preserve">cost.</w:t>
-      </w:r>
-      <w:r>
-        <w:t xml:space="preserve"> </w:t>
-      </w:r>
-      <w:r>
-        <w:t xml:space="preserve">The</w:t>
-      </w:r>
-      <w:r>
-        <w:t xml:space="preserve"> </w:t>
-      </w:r>
-      <w:r>
-        <w:t xml:space="preserve">solution</w:t>
-      </w:r>
-      <w:r>
-        <w:t xml:space="preserve"> </w:t>
-      </w:r>
-      <w:r>
-        <w:t xml:space="preserve">is</w:t>
-      </w:r>
-      <w:r>
-        <w:t xml:space="preserve"> </w:t>
-      </w:r>
-      <w:r>
-        <w:t xml:space="preserve">a</w:t>
-      </w:r>
-      <w:r>
-        <w:t xml:space="preserve"> </w:t>
-      </w:r>
-      <w:r>
-        <w:t xml:space="preserve">closed-form</w:t>
-      </w:r>
-      <w:r>
-        <w:t xml:space="preserve"> </w:t>
-      </w:r>
-      <w:r>
-        <w:t xml:space="preserve">retraining</w:t>
-      </w:r>
-      <w:r>
-        <w:t xml:space="preserve"> </w:t>
-      </w:r>
-      <w:r>
-        <w:t xml:space="preserve">threshold</w:t>
-      </w:r>
-      <w:r>
-        <w:t xml:space="preserve"> </w:t>
-      </w:r>
-      <w:r>
-        <w:t xml:space="preserve">together</w:t>
-      </w:r>
-      <w:r>
-        <w:t xml:space="preserve"> </w:t>
-      </w:r>
-      <w:r>
-        <w:t xml:space="preserve">with</w:t>
-      </w:r>
-      <w:r>
-        <w:t xml:space="preserve"> </w:t>
-      </w:r>
-      <w:r>
-        <w:t xml:space="preserve">a</w:t>
-      </w:r>
-      <w:r>
-        <w:t xml:space="preserve"> </w:t>
-      </w:r>
-      <w:r>
-        <w:t xml:space="preserve">break-even</w:t>
-      </w:r>
-      <w:r>
-        <w:t xml:space="preserve"> </w:t>
-      </w:r>
-      <w:r>
-        <w:t xml:space="preserve">recovery</w:t>
-      </w:r>
-      <w:r>
-        <w:t xml:space="preserve"> </w:t>
-      </w:r>
-      <w:r>
-        <w:t xml:space="preserve">that</w:t>
-      </w:r>
-      <w:r>
-        <w:t xml:space="preserve"> </w:t>
-      </w:r>
-      <w:r>
-        <w:t xml:space="preserve">any</w:t>
-      </w:r>
-      <w:r>
-        <w:t xml:space="preserve"> </w:t>
-      </w:r>
-      <w:r>
-        <w:t xml:space="preserve">transfer</w:t>
-      </w:r>
-      <w:r>
-        <w:t xml:space="preserve"> </w:t>
-      </w:r>
-      <w:r>
-        <w:t xml:space="preserve">method</w:t>
-      </w:r>
-      <w:r>
-        <w:t xml:space="preserve"> </w:t>
-      </w:r>
-      <w:r>
-        <w:t xml:space="preserve">must</w:t>
-      </w:r>
-      <w:r>
-        <w:t xml:space="preserve"> </w:t>
-      </w:r>
-      <w:r>
-        <w:t xml:space="preserve">exceed</w:t>
+        <w:t xml:space="preserve">regular</w:t>
+      </w:r>
+      <w:r>
+        <w:t xml:space="preserve"> </w:t>
+      </w:r>
+      <w:r>
+        <w:t xml:space="preserve">release</w:t>
+      </w:r>
+      <w:r>
+        <w:t xml:space="preserve"> </w:t>
+      </w:r>
+      <w:r>
+        <w:t xml:space="preserve">schedules</w:t>
+      </w:r>
+      <w:r>
+        <w:t xml:space="preserve"> </w:t>
+      </w:r>
+      <w:r>
+        <w:t xml:space="preserve">and</w:t>
       </w:r>
       <w:r>
         <w:t xml:space="preserve"> </w:t>
@@ -813,1447 +1911,13 @@
         <w:t xml:space="preserve"> </w:t>
       </w:r>
       <w:r>
-        <w:t xml:space="preserve">be</w:t>
-      </w:r>
-      <w:r>
-        <w:t xml:space="preserve"> </w:t>
-      </w:r>
-      <w:r>
-        <w:t xml:space="preserve">worth</w:t>
-      </w:r>
-      <w:r>
-        <w:t xml:space="preserve"> </w:t>
-      </w:r>
-      <w:r>
-        <w:t xml:space="preserve">its</w:t>
-      </w:r>
-      <w:r>
-        <w:t xml:space="preserve"> </w:t>
-      </w:r>
-      <w:r>
-        <w:t xml:space="preserve">price.</w:t>
-      </w:r>
-      <w:r>
-        <w:t xml:space="preserve"> </w:t>
-      </w:r>
-      <w:r>
-        <w:t xml:space="preserve">We</w:t>
-      </w:r>
-      <w:r>
-        <w:t xml:space="preserve"> </w:t>
-      </w:r>
-      <w:r>
-        <w:t xml:space="preserve">measure</w:t>
-      </w:r>
-      <w:r>
-        <w:t xml:space="preserve"> </w:t>
-      </w:r>
-      <w:r>
-        <w:t xml:space="preserve">recovery</w:t>
-      </w:r>
-      <w:r>
-        <w:t xml:space="preserve"> </w:t>
-      </w:r>
-      <w:r>
-        <w:t xml:space="preserve">on</w:t>
-      </w:r>
-      <w:r>
-        <w:t xml:space="preserve"> </w:t>
-      </w:r>
-      <w:r>
-        <w:t xml:space="preserve">open</w:t>
-      </w:r>
-      <w:r>
-        <w:t xml:space="preserve"> </w:t>
-      </w:r>
-      <w:r>
-        <w:t xml:space="preserve">model</w:t>
-      </w:r>
-      <w:r>
-        <w:t xml:space="preserve"> </w:t>
-      </w:r>
-      <w:r>
-        <w:t xml:space="preserve">pairs.</w:t>
-      </w:r>
-      <w:r>
-        <w:t xml:space="preserve"> </w:t>
-      </w:r>
-      <w:r>
-        <w:t xml:space="preserve">Within</w:t>
-      </w:r>
-      <w:r>
-        <w:t xml:space="preserve"> </w:t>
-      </w:r>
-      <w:r>
-        <w:t xml:space="preserve">one</w:t>
-      </w:r>
-      <w:r>
-        <w:t xml:space="preserve"> </w:t>
-      </w:r>
-      <w:r>
-        <w:t xml:space="preserve">model</w:t>
-      </w:r>
-      <w:r>
-        <w:t xml:space="preserve"> </w:t>
-      </w:r>
-      <w:r>
-        <w:t xml:space="preserve">family,</w:t>
-      </w:r>
-      <w:r>
-        <w:t xml:space="preserve"> </w:t>
-      </w:r>
-      <w:r>
-        <w:t xml:space="preserve">copying</w:t>
-      </w:r>
-      <w:r>
-        <w:t xml:space="preserve"> </w:t>
-      </w:r>
-      <w:r>
-        <w:t xml:space="preserve">the</w:t>
-      </w:r>
-      <w:r>
-        <w:t xml:space="preserve"> </w:t>
-      </w:r>
-      <w:r>
-        <w:t xml:space="preserve">old</w:t>
-      </w:r>
-      <w:r>
-        <w:t xml:space="preserve"> </w:t>
-      </w:r>
-      <w:r>
-        <w:t xml:space="preserve">adapter</w:t>
-      </w:r>
-      <w:r>
-        <w:t xml:space="preserve"> </w:t>
-      </w:r>
-      <w:r>
-        <w:t xml:space="preserve">restores</w:t>
-      </w:r>
-      <w:r>
-        <w:t xml:space="preserve"> </w:t>
-      </w:r>
-      <w:r>
-        <w:t xml:space="preserve">96</w:t>
-      </w:r>
-      <w:r>
-        <w:t xml:space="preserve"> </w:t>
-      </w:r>
-      <w:r>
-        <w:t xml:space="preserve">percent</w:t>
-      </w:r>
-      <w:r>
-        <w:t xml:space="preserve"> </w:t>
-      </w:r>
-      <w:r>
-        <w:t xml:space="preserve">of</w:t>
-      </w:r>
-      <w:r>
-        <w:t xml:space="preserve"> </w:t>
-      </w:r>
-      <w:r>
-        <w:t xml:space="preserve">the</w:t>
-      </w:r>
-      <w:r>
-        <w:t xml:space="preserve"> </w:t>
-      </w:r>
-      <w:r>
-        <w:t xml:space="preserve">retraining</w:t>
-      </w:r>
-      <w:r>
-        <w:t xml:space="preserve"> </w:t>
-      </w:r>
-      <w:r>
-        <w:t xml:space="preserve">benefit</w:t>
-      </w:r>
-      <w:r>
-        <w:t xml:space="preserve"> </w:t>
-      </w:r>
-      <w:r>
-        <w:t xml:space="preserve">after</w:t>
-      </w:r>
-      <w:r>
-        <w:t xml:space="preserve"> </w:t>
-      </w:r>
-      <w:r>
-        <w:t xml:space="preserve">a</w:t>
-      </w:r>
-      <w:r>
-        <w:t xml:space="preserve"> </w:t>
-      </w:r>
-      <w:r>
-        <w:t xml:space="preserve">small</w:t>
-      </w:r>
-      <w:r>
-        <w:t xml:space="preserve"> </w:t>
-      </w:r>
-      <w:r>
-        <w:t xml:space="preserve">upgrade,</w:t>
-      </w:r>
-      <w:r>
-        <w:t xml:space="preserve"> </w:t>
-      </w:r>
-      <w:r>
-        <w:t xml:space="preserve">55</w:t>
-      </w:r>
-      <w:r>
-        <w:t xml:space="preserve"> </w:t>
-      </w:r>
-      <w:r>
-        <w:t xml:space="preserve">percent</w:t>
-      </w:r>
-      <w:r>
-        <w:t xml:space="preserve"> </w:t>
-      </w:r>
-      <w:r>
-        <w:t xml:space="preserve">after</w:t>
-      </w:r>
-      <w:r>
-        <w:t xml:space="preserve"> </w:t>
-      </w:r>
-      <w:r>
-        <w:t xml:space="preserve">a</w:t>
-      </w:r>
-      <w:r>
-        <w:t xml:space="preserve"> </w:t>
-      </w:r>
-      <w:r>
-        <w:t xml:space="preserve">larger</w:t>
-      </w:r>
-      <w:r>
-        <w:t xml:space="preserve"> </w:t>
-      </w:r>
-      <w:r>
-        <w:t xml:space="preserve">one,</w:t>
-      </w:r>
-      <w:r>
-        <w:t xml:space="preserve"> </w:t>
-      </w:r>
-      <w:r>
-        <w:t xml:space="preserve">and</w:t>
-      </w:r>
-      <w:r>
-        <w:t xml:space="preserve"> </w:t>
-      </w:r>
-      <w:r>
-        <w:t xml:space="preserve">only</w:t>
-      </w:r>
-      <w:r>
-        <w:t xml:space="preserve"> </w:t>
-      </w:r>
-      <w:r>
-        <w:t xml:space="preserve">32</w:t>
-      </w:r>
-      <w:r>
-        <w:t xml:space="preserve"> </w:t>
-      </w:r>
-      <w:r>
-        <w:t xml:space="preserve">to</w:t>
-      </w:r>
-      <w:r>
-        <w:t xml:space="preserve"> </w:t>
-      </w:r>
-      <w:r>
-        <w:t xml:space="preserve">36</w:t>
-      </w:r>
-      <w:r>
-        <w:t xml:space="preserve"> </w:t>
-      </w:r>
-      <w:r>
-        <w:t xml:space="preserve">percent</w:t>
-      </w:r>
-      <w:r>
-        <w:t xml:space="preserve"> </w:t>
-      </w:r>
-      <w:r>
-        <w:t xml:space="preserve">after</w:t>
-      </w:r>
-      <w:r>
-        <w:t xml:space="preserve"> </w:t>
-      </w:r>
-      <w:r>
-        <w:t xml:space="preserve">the</w:t>
-      </w:r>
-      <w:r>
-        <w:t xml:space="preserve"> </w:t>
-      </w:r>
-      <w:r>
-        <w:t xml:space="preserve">largest</w:t>
-      </w:r>
-      <w:r>
-        <w:t xml:space="preserve"> </w:t>
-      </w:r>
-      <w:r>
-        <w:t xml:space="preserve">(two</w:t>
-      </w:r>
-      <w:r>
-        <w:t xml:space="preserve"> </w:t>
-      </w:r>
-      <w:r>
-        <w:t xml:space="preserve">seeds);</w:t>
-      </w:r>
-      <w:r>
-        <w:t xml:space="preserve"> </w:t>
-      </w:r>
-      <w:r>
-        <w:t xml:space="preserve">after</w:t>
-      </w:r>
-      <w:r>
-        <w:t xml:space="preserve"> </w:t>
-      </w:r>
-      <w:r>
-        <w:t xml:space="preserve">instruction</w:t>
-      </w:r>
-      <w:r>
-        <w:t xml:space="preserve"> </w:t>
-      </w:r>
-      <w:r>
-        <w:t xml:space="preserve">tuning</w:t>
-      </w:r>
-      <w:r>
-        <w:t xml:space="preserve"> </w:t>
-      </w:r>
-      <w:r>
-        <w:t xml:space="preserve">it</w:t>
-      </w:r>
-      <w:r>
-        <w:t xml:space="preserve"> </w:t>
-      </w:r>
-      <w:r>
-        <w:t xml:space="preserve">restores</w:t>
-      </w:r>
-      <w:r>
-        <w:t xml:space="preserve"> </w:t>
-      </w:r>
-      <w:r>
-        <w:t xml:space="preserve">71</w:t>
-      </w:r>
-      <w:r>
-        <w:t xml:space="preserve"> </w:t>
-      </w:r>
-      <w:r>
-        <w:t xml:space="preserve">percent.</w:t>
-      </w:r>
-      <w:r>
-        <w:t xml:space="preserve"> </w:t>
-      </w:r>
-      <w:r>
-        <w:t xml:space="preserve">A</w:t>
-      </w:r>
-      <w:r>
-        <w:t xml:space="preserve"> </w:t>
-      </w:r>
-      <w:r>
-        <w:t xml:space="preserve">label-free,</w:t>
-      </w:r>
-      <w:r>
-        <w:t xml:space="preserve"> </w:t>
-      </w:r>
-      <w:r>
-        <w:t xml:space="preserve">closed-form</w:t>
-      </w:r>
-      <w:r>
-        <w:t xml:space="preserve"> </w:t>
-      </w:r>
-      <w:r>
-        <w:t xml:space="preserve">transfer</w:t>
-      </w:r>
-      <w:r>
-        <w:t xml:space="preserve"> </w:t>
-      </w:r>
-      <w:r>
-        <w:t xml:space="preserve">method,</w:t>
-      </w:r>
-      <w:r>
-        <w:t xml:space="preserve"> </w:t>
-      </w:r>
-      <w:r>
-        <w:t xml:space="preserve">Anchored</w:t>
-      </w:r>
-      <w:r>
-        <w:t xml:space="preserve"> </w:t>
-      </w:r>
-      <w:r>
-        <w:t xml:space="preserve">Calibration</w:t>
-      </w:r>
-      <w:r>
-        <w:t xml:space="preserve"> </w:t>
-      </w:r>
-      <w:r>
-        <w:t xml:space="preserve">Transfer</w:t>
-      </w:r>
-      <w:r>
-        <w:t xml:space="preserve"> </w:t>
-      </w:r>
-      <w:r>
-        <w:t xml:space="preserve">(ACT),</w:t>
-      </w:r>
-      <w:r>
-        <w:t xml:space="preserve"> </w:t>
-      </w:r>
-      <w:r>
-        <w:t xml:space="preserve">improves</w:t>
-      </w:r>
-      <w:r>
-        <w:t xml:space="preserve"> </w:t>
-      </w:r>
-      <w:r>
-        <w:t xml:space="preserve">on</w:t>
-      </w:r>
-      <w:r>
-        <w:t xml:space="preserve"> </w:t>
-      </w:r>
-      <w:r>
-        <w:t xml:space="preserve">copying</w:t>
-      </w:r>
-      <w:r>
-        <w:t xml:space="preserve"> </w:t>
-      </w:r>
-      <w:r>
-        <w:t xml:space="preserve">by</w:t>
-      </w:r>
-      <w:r>
-        <w:t xml:space="preserve"> </w:t>
-      </w:r>
-      <w:r>
-        <w:t xml:space="preserve">an</w:t>
-      </w:r>
-      <w:r>
-        <w:t xml:space="preserve"> </w:t>
-      </w:r>
-      <w:r>
-        <w:t xml:space="preserve">amount</w:t>
-      </w:r>
-      <w:r>
-        <w:t xml:space="preserve"> </w:t>
-      </w:r>
-      <w:r>
-        <w:t xml:space="preserve">that</w:t>
-      </w:r>
-      <w:r>
-        <w:t xml:space="preserve"> </w:t>
-      </w:r>
-      <w:r>
-        <w:t xml:space="preserve">rises</w:t>
-      </w:r>
-      <w:r>
-        <w:t xml:space="preserve"> </w:t>
-      </w:r>
-      <w:r>
-        <w:t xml:space="preserve">steadily</w:t>
-      </w:r>
-      <w:r>
-        <w:t xml:space="preserve"> </w:t>
-      </w:r>
-      <w:r>
-        <w:t xml:space="preserve">with</w:t>
-      </w:r>
-      <w:r>
-        <w:t xml:space="preserve"> </w:t>
-      </w:r>
-      <w:r>
-        <w:t xml:space="preserve">the</w:t>
-      </w:r>
-      <w:r>
-        <w:t xml:space="preserve"> </w:t>
-      </w:r>
-      <w:r>
-        <w:t xml:space="preserve">size</w:t>
-      </w:r>
-      <w:r>
-        <w:t xml:space="preserve"> </w:t>
-      </w:r>
-      <w:r>
-        <w:t xml:space="preserve">of</w:t>
-      </w:r>
-      <w:r>
-        <w:t xml:space="preserve"> </w:t>
-      </w:r>
-      <w:r>
-        <w:t xml:space="preserve">the</w:t>
-      </w:r>
-      <w:r>
-        <w:t xml:space="preserve"> </w:t>
-      </w:r>
-      <w:r>
-        <w:t xml:space="preserve">upgrade.</w:t>
-      </w:r>
-      <w:r>
-        <w:t xml:space="preserve"> </w:t>
-      </w:r>
-      <w:r>
-        <w:t xml:space="preserve">After</w:t>
-      </w:r>
-      <w:r>
-        <w:t xml:space="preserve"> </w:t>
-      </w:r>
-      <w:r>
-        <w:t xml:space="preserve">the</w:t>
-      </w:r>
-      <w:r>
-        <w:t xml:space="preserve"> </w:t>
-      </w:r>
-      <w:r>
-        <w:t xml:space="preserve">largest</w:t>
-      </w:r>
-      <w:r>
-        <w:t xml:space="preserve"> </w:t>
-      </w:r>
-      <w:r>
-        <w:t xml:space="preserve">upgrade</w:t>
-      </w:r>
-      <w:r>
-        <w:t xml:space="preserve"> </w:t>
-      </w:r>
-      <w:r>
-        <w:t xml:space="preserve">it</w:t>
-      </w:r>
-      <w:r>
-        <w:t xml:space="preserve"> </w:t>
-      </w:r>
-      <w:r>
-        <w:t xml:space="preserve">restores</w:t>
-      </w:r>
-      <w:r>
-        <w:t xml:space="preserve"> </w:t>
-      </w:r>
-      <w:r>
-        <w:t xml:space="preserve">69</w:t>
-      </w:r>
-      <w:r>
-        <w:t xml:space="preserve"> </w:t>
-      </w:r>
-      <w:r>
-        <w:t xml:space="preserve">to</w:t>
-      </w:r>
-      <w:r>
-        <w:t xml:space="preserve"> </w:t>
-      </w:r>
-      <w:r>
-        <w:t xml:space="preserve">72</w:t>
-      </w:r>
-      <w:r>
-        <w:t xml:space="preserve"> </w:t>
-      </w:r>
-      <w:r>
-        <w:t xml:space="preserve">percent</w:t>
-      </w:r>
-      <w:r>
-        <w:t xml:space="preserve"> </w:t>
-      </w:r>
-      <w:r>
-        <w:t xml:space="preserve">at</w:t>
-      </w:r>
-      <w:r>
-        <w:t xml:space="preserve"> </w:t>
-      </w:r>
-      <w:r>
-        <w:t xml:space="preserve">about</w:t>
-      </w:r>
-      <w:r>
-        <w:t xml:space="preserve"> </w:t>
-      </w:r>
-      <w:r>
-        <w:t xml:space="preserve">a</w:t>
-      </w:r>
-      <w:r>
-        <w:t xml:space="preserve"> </w:t>
-      </w:r>
-      <w:r>
-        <w:t xml:space="preserve">third</w:t>
-      </w:r>
-      <w:r>
-        <w:t xml:space="preserve"> </w:t>
-      </w:r>
-      <w:r>
-        <w:t xml:space="preserve">of</w:t>
-      </w:r>
-      <w:r>
-        <w:t xml:space="preserve"> </w:t>
-      </w:r>
-      <w:r>
-        <w:t xml:space="preserve">the</w:t>
-      </w:r>
-      <w:r>
-        <w:t xml:space="preserve"> </w:t>
-      </w:r>
-      <w:r>
-        <w:t xml:space="preserve">retraining</w:t>
-      </w:r>
-      <w:r>
-        <w:t xml:space="preserve"> </w:t>
-      </w:r>
-      <w:r>
-        <w:t xml:space="preserve">compute</w:t>
-      </w:r>
-      <w:r>
-        <w:t xml:space="preserve"> </w:t>
-      </w:r>
-      <w:r>
-        <w:t xml:space="preserve">time,</w:t>
-      </w:r>
-      <w:r>
-        <w:t xml:space="preserve"> </w:t>
-      </w:r>
-      <w:r>
-        <w:t xml:space="preserve">which</w:t>
-      </w:r>
-      <w:r>
-        <w:t xml:space="preserve"> </w:t>
-      </w:r>
-      <w:r>
-        <w:t xml:space="preserve">makes</w:t>
-      </w:r>
-      <w:r>
-        <w:t xml:space="preserve"> </w:t>
-      </w:r>
-      <w:r>
-        <w:t xml:space="preserve">it</w:t>
-      </w:r>
-      <w:r>
-        <w:t xml:space="preserve"> </w:t>
-      </w:r>
-      <w:r>
-        <w:t xml:space="preserve">the</w:t>
-      </w:r>
-      <w:r>
-        <w:t xml:space="preserve"> </w:t>
-      </w:r>
-      <w:r>
-        <w:t xml:space="preserve">cost-minimizing</w:t>
-      </w:r>
-      <w:r>
-        <w:t xml:space="preserve"> </w:t>
-      </w:r>
-      <w:r>
-        <w:t xml:space="preserve">policy</w:t>
-      </w:r>
-      <w:r>
-        <w:t xml:space="preserve"> </w:t>
-      </w:r>
-      <w:r>
-        <w:t xml:space="preserve">for</w:t>
-      </w:r>
-      <w:r>
-        <w:t xml:space="preserve"> </w:t>
-      </w:r>
-      <w:r>
-        <w:t xml:space="preserve">adapters</w:t>
-      </w:r>
-      <w:r>
-        <w:t xml:space="preserve"> </w:t>
-      </w:r>
-      <w:r>
-        <w:t xml:space="preserve">whose</w:t>
-      </w:r>
-      <w:r>
-        <w:t xml:space="preserve"> </w:t>
-      </w:r>
-      <w:r>
-        <w:t xml:space="preserve">annual</w:t>
-      </w:r>
-      <w:r>
-        <w:t xml:space="preserve"> </w:t>
-      </w:r>
-      <w:r>
-        <w:t xml:space="preserve">value</w:t>
-      </w:r>
-      <w:r>
-        <w:t xml:space="preserve"> </w:t>
-      </w:r>
-      <w:r>
-        <w:t xml:space="preserve">is</w:t>
-      </w:r>
-      <w:r>
-        <w:t xml:space="preserve"> </w:t>
-      </w:r>
-      <w:r>
-        <w:t xml:space="preserve">roughly</w:t>
-      </w:r>
-      <w:r>
-        <w:t xml:space="preserve"> </w:t>
-      </w:r>
-      <w:r>
-        <w:t xml:space="preserve">1.8</w:t>
-      </w:r>
-      <w:r>
-        <w:t xml:space="preserve"> </w:t>
-      </w:r>
-      <w:r>
-        <w:t xml:space="preserve">to</w:t>
-      </w:r>
-      <w:r>
-        <w:t xml:space="preserve"> </w:t>
-      </w:r>
-      <w:r>
-        <w:t xml:space="preserve">4.4</w:t>
-      </w:r>
-      <w:r>
-        <w:t xml:space="preserve"> </w:t>
-      </w:r>
-      <w:r>
-        <w:t xml:space="preserve">times</w:t>
-      </w:r>
-      <w:r>
-        <w:t xml:space="preserve"> </w:t>
-      </w:r>
-      <w:r>
-        <w:t xml:space="preserve">the</w:t>
-      </w:r>
-      <w:r>
-        <w:t xml:space="preserve"> </w:t>
-      </w:r>
-      <w:r>
-        <w:t xml:space="preserve">retraining</w:t>
-      </w:r>
-      <w:r>
-        <w:t xml:space="preserve"> </w:t>
-      </w:r>
-      <w:r>
-        <w:t xml:space="preserve">cost.</w:t>
-      </w:r>
-      <w:r>
-        <w:t xml:space="preserve"> </w:t>
-      </w:r>
-      <w:r>
-        <w:t xml:space="preserve">The</w:t>
-      </w:r>
-      <w:r>
-        <w:t xml:space="preserve"> </w:t>
-      </w:r>
-      <w:r>
-        <w:t xml:space="preserve">pattern</w:t>
-      </w:r>
-      <w:r>
-        <w:t xml:space="preserve"> </w:t>
-      </w:r>
-      <w:r>
-        <w:t xml:space="preserve">repeats</w:t>
-      </w:r>
-      <w:r>
-        <w:t xml:space="preserve"> </w:t>
-      </w:r>
-      <w:r>
-        <w:t xml:space="preserve">at</w:t>
-      </w:r>
-      <w:r>
-        <w:t xml:space="preserve"> </w:t>
-      </w:r>
-      <w:r>
-        <w:t xml:space="preserve">70</w:t>
-      </w:r>
-      <w:r>
-        <w:t xml:space="preserve"> </w:t>
-      </w:r>
-      <w:r>
-        <w:t xml:space="preserve">and</w:t>
-      </w:r>
-      <w:r>
-        <w:t xml:space="preserve"> </w:t>
-      </w:r>
-      <w:r>
-        <w:t xml:space="preserve">410</w:t>
-      </w:r>
-      <w:r>
-        <w:t xml:space="preserve"> </w:t>
-      </w:r>
-      <w:r>
-        <w:t xml:space="preserve">million</w:t>
-      </w:r>
-      <w:r>
-        <w:t xml:space="preserve"> </w:t>
-      </w:r>
-      <w:r>
-        <w:t xml:space="preserve">parameters.</w:t>
-      </w:r>
-      <w:r>
-        <w:t xml:space="preserve"> </w:t>
-      </w:r>
-      <w:r>
-        <w:t xml:space="preserve">ACT’s</w:t>
-      </w:r>
-      <w:r>
-        <w:t xml:space="preserve"> </w:t>
-      </w:r>
-      <w:r>
-        <w:t xml:space="preserve">compute</w:t>
-      </w:r>
-      <w:r>
-        <w:t xml:space="preserve"> </w:t>
-      </w:r>
-      <w:r>
-        <w:t xml:space="preserve">time</w:t>
-      </w:r>
-      <w:r>
-        <w:t xml:space="preserve"> </w:t>
-      </w:r>
-      <w:r>
-        <w:t xml:space="preserve">relative</w:t>
-      </w:r>
-      <w:r>
-        <w:t xml:space="preserve"> </w:t>
-      </w:r>
-      <w:r>
-        <w:t xml:space="preserve">to</w:t>
-      </w:r>
-      <w:r>
-        <w:t xml:space="preserve"> </w:t>
-      </w:r>
-      <w:r>
-        <w:t xml:space="preserve">retraining</w:t>
-      </w:r>
-      <w:r>
-        <w:t xml:space="preserve"> </w:t>
-      </w:r>
-      <w:r>
-        <w:t xml:space="preserve">rose</w:t>
-      </w:r>
-      <w:r>
-        <w:t xml:space="preserve"> </w:t>
-      </w:r>
-      <w:r>
-        <w:t xml:space="preserve">from</w:t>
-      </w:r>
-      <w:r>
-        <w:t xml:space="preserve"> </w:t>
-      </w:r>
-      <w:r>
-        <w:t xml:space="preserve">0.14</w:t>
-      </w:r>
-      <w:r>
-        <w:t xml:space="preserve"> </w:t>
-      </w:r>
-      <w:r>
-        <w:t xml:space="preserve">to</w:t>
-      </w:r>
-      <w:r>
-        <w:t xml:space="preserve"> </w:t>
-      </w:r>
-      <w:r>
-        <w:t xml:space="preserve">0.70</w:t>
-      </w:r>
-      <w:r>
-        <w:t xml:space="preserve"> </w:t>
-      </w:r>
-      <w:r>
-        <w:t xml:space="preserve">with</w:t>
-      </w:r>
-      <w:r>
-        <w:t xml:space="preserve"> </w:t>
-      </w:r>
-      <w:r>
-        <w:t xml:space="preserve">model</w:t>
-      </w:r>
-      <w:r>
-        <w:t xml:space="preserve"> </w:t>
-      </w:r>
-      <w:r>
-        <w:t xml:space="preserve">size</w:t>
-      </w:r>
-      <w:r>
-        <w:t xml:space="preserve"> </w:t>
-      </w:r>
-      <w:r>
-        <w:t xml:space="preserve">in</w:t>
-      </w:r>
-      <w:r>
-        <w:t xml:space="preserve"> </w:t>
-      </w:r>
-      <w:r>
-        <w:t xml:space="preserve">our</w:t>
-      </w:r>
-      <w:r>
-        <w:t xml:space="preserve"> </w:t>
-      </w:r>
-      <w:r>
-        <w:t xml:space="preserve">first</w:t>
-      </w:r>
-      <w:r>
-        <w:t xml:space="preserve"> </w:t>
-      </w:r>
-      <w:r>
-        <w:t xml:space="preserve">implementation;</w:t>
-      </w:r>
-      <w:r>
-        <w:t xml:space="preserve"> </w:t>
-      </w:r>
-      <w:r>
-        <w:t xml:space="preserve">caching</w:t>
-      </w:r>
-      <w:r>
-        <w:t xml:space="preserve"> </w:t>
-      </w:r>
-      <w:r>
-        <w:t xml:space="preserve">layer</w:t>
-      </w:r>
-      <w:r>
-        <w:t xml:space="preserve"> </w:t>
-      </w:r>
-      <w:r>
-        <w:t xml:space="preserve">inputs,</w:t>
-      </w:r>
-      <w:r>
-        <w:t xml:space="preserve"> </w:t>
-      </w:r>
-      <w:r>
-        <w:t xml:space="preserve">which</w:t>
-      </w:r>
-      <w:r>
-        <w:t xml:space="preserve"> </w:t>
-      </w:r>
-      <w:r>
-        <w:t xml:space="preserve">leaves</w:t>
-      </w:r>
-      <w:r>
-        <w:t xml:space="preserve"> </w:t>
-      </w:r>
-      <w:r>
-        <w:t xml:space="preserve">its</w:t>
-      </w:r>
-      <w:r>
-        <w:t xml:space="preserve"> </w:t>
-      </w:r>
-      <w:r>
-        <w:t xml:space="preserve">output</w:t>
-      </w:r>
-      <w:r>
-        <w:t xml:space="preserve"> </w:t>
-      </w:r>
-      <w:r>
-        <w:t xml:space="preserve">unchanged,</w:t>
-      </w:r>
-      <w:r>
-        <w:t xml:space="preserve"> </w:t>
-      </w:r>
-      <w:r>
-        <w:t xml:space="preserve">lowers</w:t>
-      </w:r>
-      <w:r>
-        <w:t xml:space="preserve"> </w:t>
-      </w:r>
-      <w:r>
-        <w:t xml:space="preserve">the</w:t>
-      </w:r>
-      <w:r>
-        <w:t xml:space="preserve"> </w:t>
-      </w:r>
-      <w:r>
-        <w:t xml:space="preserve">410-million</w:t>
-      </w:r>
-      <w:r>
-        <w:t xml:space="preserve"> </w:t>
-      </w:r>
-      <w:r>
-        <w:t xml:space="preserve">figure</w:t>
-      </w:r>
-      <w:r>
-        <w:t xml:space="preserve"> </w:t>
-      </w:r>
-      <w:r>
-        <w:t xml:space="preserve">to</w:t>
-      </w:r>
-      <w:r>
-        <w:t xml:space="preserve"> </w:t>
-      </w:r>
-      <w:r>
-        <w:t xml:space="preserve">0.28,</w:t>
-      </w:r>
-      <w:r>
-        <w:t xml:space="preserve"> </w:t>
-      </w:r>
-      <w:r>
-        <w:t xml:space="preserve">still</w:t>
-      </w:r>
-      <w:r>
-        <w:t xml:space="preserve"> </w:t>
-      </w:r>
-      <w:r>
-        <w:t xml:space="preserve">above</w:t>
-      </w:r>
-      <w:r>
-        <w:t xml:space="preserve"> </w:t>
-      </w:r>
-      <w:r>
-        <w:t xml:space="preserve">the</w:t>
-      </w:r>
-      <w:r>
-        <w:t xml:space="preserve"> </w:t>
-      </w:r>
-      <w:r>
-        <w:t xml:space="preserve">break-even</w:t>
-      </w:r>
-      <w:r>
-        <w:t xml:space="preserve"> </w:t>
-      </w:r>
-      <w:r>
-        <w:t xml:space="preserve">of</w:t>
-      </w:r>
-      <w:r>
-        <w:t xml:space="preserve"> </w:t>
-      </w:r>
-      <w:r>
-        <w:t xml:space="preserve">0.21,</w:t>
-      </w:r>
-      <w:r>
-        <w:t xml:space="preserve"> </w:t>
-      </w:r>
-      <w:r>
-        <w:t xml:space="preserve">so</w:t>
-      </w:r>
-      <w:r>
-        <w:t xml:space="preserve"> </w:t>
-      </w:r>
-      <w:r>
-        <w:t xml:space="preserve">at</w:t>
-      </w:r>
-      <w:r>
-        <w:t xml:space="preserve"> </w:t>
-      </w:r>
-      <w:r>
-        <w:t xml:space="preserve">that</w:t>
-      </w:r>
-      <w:r>
-        <w:t xml:space="preserve"> </w:t>
-      </w:r>
-      <w:r>
-        <w:t xml:space="preserve">size</w:t>
-      </w:r>
-      <w:r>
-        <w:t xml:space="preserve"> </w:t>
-      </w:r>
-      <w:r>
-        <w:t xml:space="preserve">ACT</w:t>
-      </w:r>
-      <w:r>
-        <w:t xml:space="preserve"> </w:t>
-      </w:r>
-      <w:r>
-        <w:t xml:space="preserve">does</w:t>
-      </w:r>
-      <w:r>
-        <w:t xml:space="preserve"> </w:t>
-      </w:r>
-      <w:r>
-        <w:t xml:space="preserve">not</w:t>
-      </w:r>
-      <w:r>
-        <w:t xml:space="preserve"> </w:t>
-      </w:r>
-      <w:r>
-        <w:t xml:space="preserve">pay.</w:t>
-      </w:r>
-      <w:r>
-        <w:t xml:space="preserve"> </w:t>
-      </w:r>
-      <w:r>
-        <w:t xml:space="preserve">After</w:t>
-      </w:r>
-      <w:r>
-        <w:t xml:space="preserve"> </w:t>
-      </w:r>
-      <w:r>
-        <w:t xml:space="preserve">smaller</w:t>
-      </w:r>
-      <w:r>
-        <w:t xml:space="preserve"> </w:t>
-      </w:r>
-      <w:r>
-        <w:t xml:space="preserve">upgrades</w:t>
-      </w:r>
-      <w:r>
-        <w:t xml:space="preserve"> </w:t>
-      </w:r>
-      <w:r>
-        <w:t xml:space="preserve">its</w:t>
-      </w:r>
-      <w:r>
-        <w:t xml:space="preserve"> </w:t>
-      </w:r>
-      <w:r>
-        <w:t xml:space="preserve">gain</w:t>
-      </w:r>
-      <w:r>
-        <w:t xml:space="preserve"> </w:t>
-      </w:r>
-      <w:r>
-        <w:t xml:space="preserve">does</w:t>
-      </w:r>
-      <w:r>
-        <w:t xml:space="preserve"> </w:t>
-      </w:r>
-      <w:r>
-        <w:t xml:space="preserve">not</w:t>
-      </w:r>
-      <w:r>
-        <w:t xml:space="preserve"> </w:t>
-      </w:r>
-      <w:r>
-        <w:t xml:space="preserve">cover</w:t>
-      </w:r>
-      <w:r>
-        <w:t xml:space="preserve"> </w:t>
-      </w:r>
-      <w:r>
-        <w:t xml:space="preserve">its</w:t>
-      </w:r>
-      <w:r>
-        <w:t xml:space="preserve"> </w:t>
-      </w:r>
-      <w:r>
-        <w:t xml:space="preserve">cost,</w:t>
-      </w:r>
-      <w:r>
-        <w:t xml:space="preserve"> </w:t>
-      </w:r>
-      <w:r>
-        <w:t xml:space="preserve">and</w:t>
-      </w:r>
-      <w:r>
-        <w:t xml:space="preserve"> </w:t>
-      </w:r>
-      <w:r>
-        <w:t xml:space="preserve">on</w:t>
-      </w:r>
-      <w:r>
-        <w:t xml:space="preserve"> </w:t>
-      </w:r>
-      <w:r>
-        <w:t xml:space="preserve">an</w:t>
-      </w:r>
-      <w:r>
-        <w:t xml:space="preserve"> </w:t>
-      </w:r>
-      <w:r>
-        <w:t xml:space="preserve">instruction-tuned</w:t>
-      </w:r>
-      <w:r>
-        <w:t xml:space="preserve"> </w:t>
-      </w:r>
-      <w:r>
-        <w:t xml:space="preserve">pair</w:t>
-      </w:r>
-      <w:r>
-        <w:t xml:space="preserve"> </w:t>
-      </w:r>
-      <w:r>
-        <w:t xml:space="preserve">it</w:t>
-      </w:r>
-      <w:r>
-        <w:t xml:space="preserve"> </w:t>
-      </w:r>
-      <w:r>
-        <w:t xml:space="preserve">gives</w:t>
-      </w:r>
-      <w:r>
-        <w:t xml:space="preserve"> </w:t>
-      </w:r>
-      <w:r>
-        <w:t xml:space="preserve">no</w:t>
-      </w:r>
-      <w:r>
-        <w:t xml:space="preserve"> </w:t>
-      </w:r>
-      <w:r>
-        <w:t xml:space="preserve">gain</w:t>
-      </w:r>
-      <w:r>
-        <w:t xml:space="preserve"> </w:t>
-      </w:r>
-      <w:r>
-        <w:t xml:space="preserve">at</w:t>
-      </w:r>
-      <w:r>
-        <w:t xml:space="preserve"> </w:t>
-      </w:r>
-      <w:r>
-        <w:t xml:space="preserve">all,</w:t>
-      </w:r>
-      <w:r>
-        <w:t xml:space="preserve"> </w:t>
-      </w:r>
-      <w:r>
-        <w:t xml:space="preserve">for</w:t>
-      </w:r>
-      <w:r>
-        <w:t xml:space="preserve"> </w:t>
-      </w:r>
-      <w:r>
-        <w:t xml:space="preserve">a</w:t>
-      </w:r>
-      <w:r>
-        <w:t xml:space="preserve"> </w:t>
-      </w:r>
-      <w:r>
-        <w:t xml:space="preserve">reason</w:t>
-      </w:r>
-      <w:r>
-        <w:t xml:space="preserve"> </w:t>
-      </w:r>
-      <w:r>
-        <w:t xml:space="preserve">we</w:t>
-      </w:r>
-      <w:r>
-        <w:t xml:space="preserve"> </w:t>
-      </w:r>
-      <w:r>
-        <w:t xml:space="preserve">could</w:t>
-      </w:r>
-      <w:r>
-        <w:t xml:space="preserve"> </w:t>
-      </w:r>
-      <w:r>
-        <w:t xml:space="preserve">not</w:t>
-      </w:r>
-      <w:r>
-        <w:t xml:space="preserve"> </w:t>
-      </w:r>
-      <w:r>
-        <w:t xml:space="preserve">identify.</w:t>
-      </w:r>
-      <w:r>
-        <w:t xml:space="preserve"> </w:t>
-      </w:r>
-      <w:r>
-        <w:t xml:space="preserve">Simulations</w:t>
-      </w:r>
-      <w:r>
-        <w:t xml:space="preserve"> </w:t>
-      </w:r>
-      <w:r>
-        <w:t xml:space="preserve">with</w:t>
-      </w:r>
-      <w:r>
-        <w:t xml:space="preserve"> </w:t>
-      </w:r>
-      <w:r>
-        <w:t xml:space="preserve">clustered</w:t>
-      </w:r>
-      <w:r>
-        <w:t xml:space="preserve"> </w:t>
-      </w:r>
-      <w:r>
-        <w:t xml:space="preserve">and</w:t>
-      </w:r>
-      <w:r>
-        <w:t xml:space="preserve"> </w:t>
-      </w:r>
-      <w:r>
-        <w:t xml:space="preserve">regular</w:t>
-      </w:r>
-      <w:r>
-        <w:t xml:space="preserve"> </w:t>
-      </w:r>
-      <w:r>
-        <w:t xml:space="preserve">release</w:t>
-      </w:r>
-      <w:r>
-        <w:t xml:space="preserve"> </w:t>
-      </w:r>
-      <w:r>
-        <w:t xml:space="preserve">schedules</w:t>
-      </w:r>
-      <w:r>
-        <w:t xml:space="preserve"> </w:t>
-      </w:r>
-      <w:r>
-        <w:t xml:space="preserve">and</w:t>
-      </w:r>
-      <w:r>
-        <w:t xml:space="preserve"> </w:t>
-      </w:r>
-      <w:r>
-        <w:t xml:space="preserve">with</w:t>
-      </w:r>
-      <w:r>
-        <w:t xml:space="preserve"> </w:t>
-      </w:r>
-      <w:r>
         <w:t xml:space="preserve">jump</w:t>
       </w:r>
       <w:r>
         <w:t xml:space="preserve"> </w:t>
       </w:r>
       <w:r>
-        <w:t xml:space="preserve">risk</w:t>
-      </w:r>
-      <w:r>
-        <w:t xml:space="preserve"> </w:t>
-      </w:r>
-      <w:r>
-        <w:t xml:space="preserve">show</w:t>
-      </w:r>
-      <w:r>
-        <w:t xml:space="preserve"> </w:t>
-      </w:r>
-      <w:r>
-        <w:t xml:space="preserve">that</w:t>
-      </w:r>
-      <w:r>
-        <w:t xml:space="preserve"> </w:t>
-      </w:r>
-      <w:r>
-        <w:t xml:space="preserve">the</w:t>
-      </w:r>
-      <w:r>
-        <w:t xml:space="preserve"> </w:t>
-      </w:r>
-      <w:r>
-        <w:t xml:space="preserve">policy</w:t>
-      </w:r>
-      <w:r>
-        <w:t xml:space="preserve"> </w:t>
-      </w:r>
-      <w:r>
-        <w:t xml:space="preserve">ranking</w:t>
-      </w:r>
-      <w:r>
-        <w:t xml:space="preserve"> </w:t>
-      </w:r>
-      <w:r>
-        <w:t xml:space="preserve">is</w:t>
-      </w:r>
-      <w:r>
-        <w:t xml:space="preserve"> </w:t>
-      </w:r>
-      <w:r>
-        <w:t xml:space="preserve">robust,</w:t>
-      </w:r>
-      <w:r>
-        <w:t xml:space="preserve"> </w:t>
-      </w:r>
-      <w:r>
-        <w:t xml:space="preserve">although</w:t>
-      </w:r>
-      <w:r>
-        <w:t xml:space="preserve"> </w:t>
-      </w:r>
-      <w:r>
-        <w:t xml:space="preserve">the</w:t>
-      </w:r>
-      <w:r>
-        <w:t xml:space="preserve"> </w:t>
-      </w:r>
-      <w:r>
-        <w:t xml:space="preserve">optimal</w:t>
-      </w:r>
-      <w:r>
-        <w:t xml:space="preserve"> </w:t>
-      </w:r>
-      <w:r>
-        <w:t xml:space="preserve">threshold</w:t>
-      </w:r>
-      <w:r>
-        <w:t xml:space="preserve"> </w:t>
-      </w:r>
-      <w:r>
-        <w:t xml:space="preserve">moves</w:t>
-      </w:r>
-      <w:r>
-        <w:t xml:space="preserve"> </w:t>
-      </w:r>
-      <w:r>
-        <w:t xml:space="preserve">by</w:t>
-      </w:r>
-      <w:r>
-        <w:t xml:space="preserve"> </w:t>
-      </w:r>
-      <w:r>
-        <w:t xml:space="preserve">20</w:t>
-      </w:r>
-      <w:r>
-        <w:t xml:space="preserve"> </w:t>
-      </w:r>
-      <w:r>
-        <w:t xml:space="preserve">percent</w:t>
-      </w:r>
-      <w:r>
-        <w:t xml:space="preserve"> </w:t>
-      </w:r>
-      <w:r>
-        <w:t xml:space="preserve">or</w:t>
-      </w:r>
-      <w:r>
-        <w:t xml:space="preserve"> </w:t>
-      </w:r>
-      <w:r>
-        <w:t xml:space="preserve">more.</w:t>
-      </w:r>
-      <w:r>
-        <w:t xml:space="preserve"> </w:t>
-      </w:r>
-      <w:r>
-        <w:t xml:space="preserve">The</w:t>
-      </w:r>
-      <w:r>
-        <w:t xml:space="preserve"> </w:t>
-      </w:r>
-      <w:r>
-        <w:t xml:space="preserve">model</w:t>
-      </w:r>
-      <w:r>
-        <w:t xml:space="preserve"> </w:t>
-      </w:r>
-      <w:r>
-        <w:t xml:space="preserve">gives</w:t>
-      </w:r>
-      <w:r>
-        <w:t xml:space="preserve"> </w:t>
-      </w:r>
-      <w:r>
-        <w:t xml:space="preserve">practitioners</w:t>
-      </w:r>
-      <w:r>
-        <w:t xml:space="preserve"> </w:t>
-      </w:r>
-      <w:r>
-        <w:t xml:space="preserve">a</w:t>
-      </w:r>
-      <w:r>
-        <w:t xml:space="preserve"> </w:t>
-      </w:r>
-      <w:r>
-        <w:t xml:space="preserve">checkable</w:t>
-      </w:r>
-      <w:r>
-        <w:t xml:space="preserve"> </w:t>
-      </w:r>
-      <w:r>
-        <w:t xml:space="preserve">rule</w:t>
-      </w:r>
-      <w:r>
-        <w:t xml:space="preserve"> </w:t>
-      </w:r>
-      <w:r>
-        <w:t xml:space="preserve">for</w:t>
-      </w:r>
-      <w:r>
-        <w:t xml:space="preserve"> </w:t>
-      </w:r>
-      <w:r>
-        <w:t xml:space="preserve">when</w:t>
-      </w:r>
-      <w:r>
-        <w:t xml:space="preserve"> </w:t>
-      </w:r>
-      <w:r>
-        <w:t xml:space="preserve">transfer</w:t>
-      </w:r>
-      <w:r>
-        <w:t xml:space="preserve"> </w:t>
-      </w:r>
-      <w:r>
-        <w:t xml:space="preserve">is</w:t>
-      </w:r>
-      <w:r>
-        <w:t xml:space="preserve"> </w:t>
-      </w:r>
-      <w:r>
-        <w:t xml:space="preserve">worth</w:t>
-      </w:r>
-      <w:r>
-        <w:t xml:space="preserve"> </w:t>
-      </w:r>
-      <w:r>
-        <w:t xml:space="preserve">buying.</w:t>
+        <w:t xml:space="preserve">risk.</w:t>
       </w:r>
     </w:p>
     <w:p>
@@ -2439,84 +2103,13 @@
           <w:iCs/>
           <w:i/>
         </w:rPr>
-        <w:t xml:space="preserve">A decision model.</w:t>
-      </w:r>
-      <w:r>
-        <w:t xml:space="preserve"> </w:t>
-      </w:r>
-      <w:r>
-        <w:t xml:space="preserve">We cast the maintenance problem as an optimal stopping problem with Poisson upgrades and geometric</w:t>
-      </w:r>
-      <w:r>
-        <w:t xml:space="preserve"> </w:t>
-      </w:r>
-      <w:r>
-        <w:t xml:space="preserve">Brownian motion (GBM) value, and derive the optimal retraining threshold in closed form (Propositions 1–3).</w:t>
-      </w:r>
-      <w:r>
-        <w:t xml:space="preserve"> </w:t>
-      </w:r>
-      <w:r>
-        <w:t xml:space="preserve">A transfer method with recovery</w:t>
-      </w:r>
-      <w:r>
-        <w:t xml:space="preserve"> </w:t>
-      </w:r>
-      <m:oMath>
-        <m:r>
-          <m:t>R</m:t>
-        </m:r>
-      </m:oMath>
-      <w:r>
-        <w:t xml:space="preserve"> </w:t>
-      </w:r>
-      <w:r>
-        <w:t xml:space="preserve">and cost</w:t>
-      </w:r>
-      <w:r>
-        <w:t xml:space="preserve"> </w:t>
-      </w:r>
-      <m:oMath>
-        <m:r>
-          <m:t>C</m:t>
-        </m:r>
-      </m:oMath>
-      <w:r>
-        <w:t xml:space="preserve"> </w:t>
-      </w:r>
-      <w:r>
-        <w:t xml:space="preserve">is worth adopting if and only if</w:t>
-      </w:r>
-      <w:r>
-        <w:t xml:space="preserve"> </w:t>
-      </w:r>
-      <m:oMath>
-        <m:r>
-          <m:t>C</m:t>
-        </m:r>
-      </m:oMath>
-      <w:r>
-        <w:t xml:space="preserve"> </w:t>
-      </w:r>
-      <w:r>
-        <w:t xml:space="preserve">is below an explicit bound</w:t>
-      </w:r>
-      <w:r>
-        <w:t xml:space="preserve"> </w:t>
-      </w:r>
-      <m:oMath>
-        <m:r>
-          <m:t>Γ</m:t>
-        </m:r>
-      </m:oMath>
-      <w:r>
-        <w:t xml:space="preserve">. Equivalently, every method has a</w:t>
-      </w:r>
-      <w:r>
-        <w:t xml:space="preserve"> </w:t>
-      </w:r>
-      <w:r>
-        <w:t xml:space="preserve">break-even recovery that a team can check before buying it.</w:t>
+        <w:t xml:space="preserve">A closed-form, label-free transfer method.</w:t>
+      </w:r>
+      <w:r>
+        <w:t xml:space="preserve"> </w:t>
+      </w:r>
+      <w:r>
+        <w:t xml:space="preserve">Anchored Calibration Transfer (ACT) corrects the input projection of each low-rank adapter module by a ridge regression on activation statistics of the source and target models, using only unlabeled task inputs. Section 5 gives the method, its complexity, and a cached implementation.</w:t>
       </w:r>
     </w:p>
     <w:p>
@@ -2531,25 +2124,13 @@
           <w:iCs/>
           <w:i/>
         </w:rPr>
-        <w:t xml:space="preserve">Recovery of naive reuse as a function of upgrade size.</w:t>
-      </w:r>
-      <w:r>
-        <w:t xml:space="preserve"> </w:t>
-      </w:r>
-      <w:r>
-        <w:t xml:space="preserve">On open model pairs, copying the old adapter recovers 96% of the retraining</w:t>
-      </w:r>
-      <w:r>
-        <w:t xml:space="preserve"> </w:t>
-      </w:r>
-      <w:r>
-        <w:t xml:space="preserve">benefit after a small upgrade, 55% after a larger one, and only 32% to 36% after the largest; after an instruction-tuning upgrade it recovers 71%. Through the model these numbers imply</w:t>
-      </w:r>
-      <w:r>
-        <w:t xml:space="preserve"> </w:t>
-      </w:r>
-      <w:r>
-        <w:t xml:space="preserve">retraining thresholds from about 4 to about 56 times the retraining cost, so the right policy depends strongly on how far the model moved.</w:t>
+        <w:t xml:space="preserve">A cost analysis and a faster implementation.</w:t>
+      </w:r>
+      <w:r>
+        <w:t xml:space="preserve"> </w:t>
+      </w:r>
+      <w:r>
+        <w:t xml:space="preserve">A time profile shows that ACT’s cost grows faster than that of retraining because the straightforward implementation runs the network from the input once for every layer, which makes the number of layer passes quadratic in depth. Caching layer inputs makes it linear and leaves the output unchanged: on the same trained adapters the two versions select identical anchoring strengths and give identical held-out loss. The cached version is 1.4, 1.6, and 2.4 times faster at 70, 160, and 410 million parameters, and it lowers ACT’s compute time relative to retraining at 410 million parameters from 0.67 to 0.28.</w:t>
       </w:r>
     </w:p>
     <w:p>
@@ -2564,31 +2145,66 @@
           <w:iCs/>
           <w:i/>
         </w:rPr>
-        <w:t xml:space="preserve">A transfer method priced by the rule.</w:t>
-      </w:r>
-      <w:r>
-        <w:t xml:space="preserve"> </w:t>
-      </w:r>
-      <w:r>
-        <w:t xml:space="preserve">We propose Anchored Calibration Transfer (ACT), a closed-form, label-free correction of the adapter.</w:t>
-      </w:r>
-      <w:r>
-        <w:t xml:space="preserve"> </w:t>
-      </w:r>
-      <w:r>
-        <w:t xml:space="preserve">Its gain over copying rises steadily with the size of the upgrade, reaching 0.33 to 0.40 after the largest at 160 million parameters (two seeds), where it restores 69% to 72% of the retraining benefit at 30% to 36% of the retraining compute time and is the</w:t>
-      </w:r>
-      <w:r>
-        <w:t xml:space="preserve"> </w:t>
-      </w:r>
-      <w:r>
-        <w:t xml:space="preserve">cost-minimizing policy over a bounded range of adapter values. The gain also appears at 70 and 410 million parameters. ACT’s compute time relative to retraining rose from 0.14 to 0.70 with model size in our first implementation, and a version that caches layer inputs and leaves the output unchanged lowers the 410-million figure to 0.28, which is still above the break-even of 0.21, so at that size ACT does not pay.</w:t>
-      </w:r>
-      <w:r>
-        <w:t xml:space="preserve"> </w:t>
-      </w:r>
-      <w:r>
-        <w:t xml:space="preserve">After smaller upgrades its gain does not cover its cost, and on the instruction-tuned pair it gives no gain, for a reason we could not identify.</w:t>
+        <w:t xml:space="preserve">A decision model that prices the method.</w:t>
+      </w:r>
+      <w:r>
+        <w:t xml:space="preserve"> </w:t>
+      </w:r>
+      <w:r>
+        <w:t xml:space="preserve">We cast the maintenance decision as an optimal stopping problem with Poisson upgrades and geometric Brownian motion (GBM) value, and derive the optimal retraining threshold in closed form (Propositions 1–3). A transfer method with recovery</w:t>
+      </w:r>
+      <w:r>
+        <w:t xml:space="preserve"> </w:t>
+      </w:r>
+      <m:oMath>
+        <m:r>
+          <m:t>R</m:t>
+        </m:r>
+      </m:oMath>
+      <w:r>
+        <w:t xml:space="preserve"> </w:t>
+      </w:r>
+      <w:r>
+        <w:t xml:space="preserve">and cost</w:t>
+      </w:r>
+      <w:r>
+        <w:t xml:space="preserve"> </w:t>
+      </w:r>
+      <m:oMath>
+        <m:r>
+          <m:t>C</m:t>
+        </m:r>
+      </m:oMath>
+      <w:r>
+        <w:t xml:space="preserve"> </w:t>
+      </w:r>
+      <w:r>
+        <w:t xml:space="preserve">is worth adopting if and only if</w:t>
+      </w:r>
+      <w:r>
+        <w:t xml:space="preserve"> </w:t>
+      </w:r>
+      <m:oMath>
+        <m:r>
+          <m:t>C</m:t>
+        </m:r>
+      </m:oMath>
+      <w:r>
+        <w:t xml:space="preserve"> </w:t>
+      </w:r>
+      <w:r>
+        <w:t xml:space="preserve">is below an explicit bound</w:t>
+      </w:r>
+      <w:r>
+        <w:t xml:space="preserve"> </w:t>
+      </w:r>
+      <m:oMath>
+        <m:r>
+          <m:t>Γ</m:t>
+        </m:r>
+      </m:oMath>
+      <w:r>
+        <w:t xml:space="preserve">; equivalently, every method has a break-even recovery that can be checked before it is bought.</w:t>
       </w:r>
     </w:p>
     <w:p>
@@ -2603,19 +2219,34 @@
           <w:iCs/>
           <w:i/>
         </w:rPr>
+        <w:t xml:space="preserve">Evidence on open model pairs.</w:t>
+      </w:r>
+      <w:r>
+        <w:t xml:space="preserve"> </w:t>
+      </w:r>
+      <w:r>
+        <w:t xml:space="preserve">Copying the old adapter recovers 96% of the retraining benefit after a small upgrade, 55% after a larger one, and only 32% to 36% after the largest; after an instruction-tuning upgrade it recovers 71%. ACT’s gain over copying rises steadily with the size of the upgrade, reaching 0.33 to 0.40 after the largest at 160 million parameters (two seeds). It covers its cost after sufficiently large upgrades at 70 and 160 million parameters but not at 410 million, where its cost ratio of 0.28 remains above the break-even of 0.21. On the instruction-tuned pair it gives no gain, for a reason we could not identify.</w:t>
+      </w:r>
+    </w:p>
+    <w:p>
+      <w:pPr>
+        <w:numPr>
+          <w:ilvl w:val="0"/>
+          <w:numId w:val="1001"/>
+        </w:numPr>
+      </w:pPr>
+      <w:r>
+        <w:rPr>
+          <w:iCs/>
+          <w:i/>
+        </w:rPr>
         <w:t xml:space="preserve">Robustness of the rule.</w:t>
       </w:r>
       <w:r>
         <w:t xml:space="preserve"> </w:t>
       </w:r>
       <w:r>
-        <w:t xml:space="preserve">We simulate clustered and regular release schedules and jump risk in value. The cost of using the</w:t>
-      </w:r>
-      <w:r>
-        <w:t xml:space="preserve"> </w:t>
-      </w:r>
-      <w:r>
-        <w:t xml:space="preserve">Poisson-calibrated threshold is below 2.5% in every scenario.</w:t>
+        <w:t xml:space="preserve">We simulate clustered and regular release schedules and jump risk in value. The cost of using the Poisson-calibrated threshold is below 2.5% in every scenario.</w:t>
       </w:r>
     </w:p>
     <w:p>
@@ -6686,6 +6317,632 @@
         <w:t xml:space="preserve">implementation it takes 30% to 65% of the time of the retraining runs on the full-size CPU settings (Section 7).</w:t>
       </w:r>
     </w:p>
+    <w:p>
+      <w:pPr>
+        <w:pStyle w:val="BodyText"/>
+      </w:pPr>
+      <w:r>
+        <w:rPr>
+          <w:bCs/>
+          <w:b/>
+        </w:rPr>
+        <w:t xml:space="preserve">Algorithm and complexity.</w:t>
+      </w:r>
+      <w:r>
+        <w:t xml:space="preserve"> </w:t>
+      </w:r>
+      <w:r>
+        <w:t xml:space="preserve">Let the model have</w:t>
+      </w:r>
+      <w:r>
+        <w:t xml:space="preserve"> </w:t>
+      </w:r>
+      <m:oMath>
+        <m:r>
+          <m:t>L</m:t>
+        </m:r>
+      </m:oMath>
+      <w:r>
+        <w:t xml:space="preserve"> </w:t>
+      </w:r>
+      <w:r>
+        <w:t xml:space="preserve">decoder layers, let</w:t>
+      </w:r>
+      <w:r>
+        <w:t xml:space="preserve"> </w:t>
+      </w:r>
+      <m:oMath>
+        <m:r>
+          <m:t>N</m:t>
+        </m:r>
+      </m:oMath>
+      <w:r>
+        <w:t xml:space="preserve"> </w:t>
+      </w:r>
+      <w:r>
+        <w:t xml:space="preserve">be the number of calibration tokens, and let</w:t>
+      </w:r>
+      <w:r>
+        <w:t xml:space="preserve"> </w:t>
+      </w:r>
+      <m:oMath>
+        <m:sSub>
+          <m:e>
+            <m:r>
+              <m:t>d</m:t>
+            </m:r>
+          </m:e>
+          <m:sub>
+            <m:r>
+              <m:rPr>
+                <m:nor/>
+                <m:sty m:val="p"/>
+              </m:rPr>
+              <m:t>in</m:t>
+            </m:r>
+          </m:sub>
+        </m:sSub>
+      </m:oMath>
+      <w:r>
+        <w:t xml:space="preserve"> </w:t>
+      </w:r>
+      <w:r>
+        <w:t xml:space="preserve">be the input width of a module. The cached implementation proceeds as follows.</w:t>
+      </w:r>
+    </w:p>
+    <w:p>
+      <w:pPr>
+        <w:numPr>
+          <w:ilvl w:val="0"/>
+          <w:numId w:val="1002"/>
+        </w:numPr>
+      </w:pPr>
+      <w:r>
+        <w:t xml:space="preserve">Run the source and the target model on each calibration batch up to the input of the first decoder layer, and cache the hidden states and the layer arguments (attention mask, position encodings), for the fit and the validation split.</w:t>
+      </w:r>
+    </w:p>
+    <w:p>
+      <w:pPr>
+        <w:numPr>
+          <w:ilvl w:val="0"/>
+          <w:numId w:val="1002"/>
+        </w:numPr>
+      </w:pPr>
+      <w:r>
+        <w:t xml:space="preserve">For each layer</w:t>
+      </w:r>
+      <w:r>
+        <w:t xml:space="preserve"> </w:t>
+      </w:r>
+      <m:oMath>
+        <m:r>
+          <m:t>l</m:t>
+        </m:r>
+        <m:r>
+          <m:rPr>
+            <m:sty m:val="p"/>
+          </m:rPr>
+          <m:t>=</m:t>
+        </m:r>
+        <m:r>
+          <m:t>1</m:t>
+        </m:r>
+        <m:r>
+          <m:rPr>
+            <m:sty m:val="p"/>
+          </m:rPr>
+          <m:t>,</m:t>
+        </m:r>
+        <m:r>
+          <m:rPr>
+            <m:sty m:val="p"/>
+          </m:rPr>
+          <m:t>…</m:t>
+        </m:r>
+        <m:r>
+          <m:rPr>
+            <m:sty m:val="p"/>
+          </m:rPr>
+          <m:t>,</m:t>
+        </m:r>
+        <m:r>
+          <m:t>L</m:t>
+        </m:r>
+      </m:oMath>
+      <w:r>
+        <w:t xml:space="preserve"> </w:t>
+      </w:r>
+      <w:r>
+        <w:t xml:space="preserve">in order from the input side: (a) run layer</w:t>
+      </w:r>
+      <w:r>
+        <w:t xml:space="preserve"> </w:t>
+      </w:r>
+      <m:oMath>
+        <m:r>
+          <m:t>l</m:t>
+        </m:r>
+      </m:oMath>
+      <w:r>
+        <w:t xml:space="preserve"> </w:t>
+      </w:r>
+      <w:r>
+        <w:t xml:space="preserve">of the source model and of the target model on the cached inputs, with hooks on the adapter modules, and accumulate for every module the matrices</w:t>
+      </w:r>
+      <w:r>
+        <w:t xml:space="preserve"> </w:t>
+      </w:r>
+      <m:oMath>
+        <m:sSub>
+          <m:e>
+            <m:r>
+              <m:t>X</m:t>
+            </m:r>
+          </m:e>
+          <m:sub>
+            <m:r>
+              <m:t>t</m:t>
+            </m:r>
+          </m:sub>
+        </m:sSub>
+        <m:sSubSup>
+          <m:e>
+            <m:r>
+              <m:t>X</m:t>
+            </m:r>
+          </m:e>
+          <m:sub>
+            <m:r>
+              <m:t>t</m:t>
+            </m:r>
+          </m:sub>
+          <m:sup>
+            <m:r>
+              <m:rPr>
+                <m:sty m:val="p"/>
+              </m:rPr>
+              <m:t>⊤</m:t>
+            </m:r>
+          </m:sup>
+        </m:sSubSup>
+      </m:oMath>
+      <w:r>
+        <w:t xml:space="preserve"> </w:t>
+      </w:r>
+      <w:r>
+        <w:t xml:space="preserve">and</w:t>
+      </w:r>
+      <w:r>
+        <w:t xml:space="preserve"> </w:t>
+      </w:r>
+      <m:oMath>
+        <m:sSub>
+          <m:e>
+            <m:r>
+              <m:t>X</m:t>
+            </m:r>
+          </m:e>
+          <m:sub>
+            <m:r>
+              <m:t>s</m:t>
+            </m:r>
+          </m:sub>
+        </m:sSub>
+        <m:sSubSup>
+          <m:e>
+            <m:r>
+              <m:t>X</m:t>
+            </m:r>
+          </m:e>
+          <m:sub>
+            <m:r>
+              <m:t>t</m:t>
+            </m:r>
+          </m:sub>
+          <m:sup>
+            <m:r>
+              <m:rPr>
+                <m:sty m:val="p"/>
+              </m:rPr>
+              <m:t>⊤</m:t>
+            </m:r>
+          </m:sup>
+        </m:sSubSup>
+      </m:oMath>
+      <w:r>
+        <w:t xml:space="preserve"> </w:t>
+      </w:r>
+      <w:r>
+        <w:t xml:space="preserve">on the fit and the validation split and</w:t>
+      </w:r>
+      <w:r>
+        <w:t xml:space="preserve"> </w:t>
+      </w:r>
+      <m:oMath>
+        <m:sSub>
+          <m:e>
+            <m:r>
+              <m:t>X</m:t>
+            </m:r>
+          </m:e>
+          <m:sub>
+            <m:r>
+              <m:t>s</m:t>
+            </m:r>
+          </m:sub>
+        </m:sSub>
+        <m:sSubSup>
+          <m:e>
+            <m:r>
+              <m:t>X</m:t>
+            </m:r>
+          </m:e>
+          <m:sub>
+            <m:r>
+              <m:t>s</m:t>
+            </m:r>
+          </m:sub>
+          <m:sup>
+            <m:r>
+              <m:rPr>
+                <m:sty m:val="p"/>
+              </m:rPr>
+              <m:t>⊤</m:t>
+            </m:r>
+          </m:sup>
+        </m:sSubSup>
+      </m:oMath>
+      <w:r>
+        <w:t xml:space="preserve"> </w:t>
+      </w:r>
+      <w:r>
+        <w:t xml:space="preserve">on the validation split; (b) for every module and each of</w:t>
+      </w:r>
+      <w:r>
+        <w:t xml:space="preserve"> </w:t>
+      </w:r>
+      <m:oMath>
+        <m:r>
+          <m:t>K</m:t>
+        </m:r>
+        <m:r>
+          <m:rPr>
+            <m:sty m:val="p"/>
+          </m:rPr>
+          <m:t>=</m:t>
+        </m:r>
+        <m:r>
+          <m:t>13</m:t>
+        </m:r>
+      </m:oMath>
+      <w:r>
+        <w:t xml:space="preserve"> </w:t>
+      </w:r>
+      <w:r>
+        <w:t xml:space="preserve">values of</w:t>
+      </w:r>
+      <w:r>
+        <w:t xml:space="preserve"> </w:t>
+      </w:r>
+      <m:oMath>
+        <m:r>
+          <m:t>α</m:t>
+        </m:r>
+      </m:oMath>
+      <w:r>
+        <w:t xml:space="preserve">, solve the ridge system on the fit matrices and score it by the validation error, which is evaluated from the accumulated matrices alone; (c) solve once more with the full matrices for the chosen</w:t>
+      </w:r>
+      <w:r>
+        <w:t xml:space="preserve"> </w:t>
+      </w:r>
+      <m:oMath>
+        <m:r>
+          <m:t>α</m:t>
+        </m:r>
+      </m:oMath>
+      <w:r>
+        <w:t xml:space="preserve"> </w:t>
+      </w:r>
+      <w:r>
+        <w:t xml:space="preserve">and overwrite</w:t>
+      </w:r>
+      <w:r>
+        <w:t xml:space="preserve"> </w:t>
+      </w:r>
+      <m:oMath>
+        <m:r>
+          <m:t>A</m:t>
+        </m:r>
+      </m:oMath>
+      <w:r>
+        <w:t xml:space="preserve">; (d) run the corrected target layer once more to obtain the cached input of layer</w:t>
+      </w:r>
+      <w:r>
+        <w:t xml:space="preserve"> </w:t>
+      </w:r>
+      <m:oMath>
+        <m:r>
+          <m:t>l</m:t>
+        </m:r>
+        <m:r>
+          <m:rPr>
+            <m:sty m:val="p"/>
+          </m:rPr>
+          <m:t>+</m:t>
+        </m:r>
+        <m:r>
+          <m:t>1</m:t>
+        </m:r>
+      </m:oMath>
+      <w:r>
+        <w:t xml:space="preserve">, and take the source output of step (a) as the next source input.</w:t>
+      </w:r>
+    </w:p>
+    <w:p>
+      <w:pPr>
+        <w:pStyle w:val="FirstParagraph"/>
+      </w:pPr>
+      <w:r>
+        <w:t xml:space="preserve">Step 2 costs</w:t>
+      </w:r>
+      <w:r>
+        <w:t xml:space="preserve"> </w:t>
+      </w:r>
+      <m:oMath>
+        <m:r>
+          <m:t>O</m:t>
+        </m:r>
+        <m:d>
+          <m:dPr>
+            <m:begChr m:val="("/>
+            <m:endChr m:val=")"/>
+            <m:sepChr m:val=""/>
+            <m:grow/>
+          </m:dPr>
+          <m:e>
+            <m:r>
+              <m:t>N</m:t>
+            </m:r>
+            <m:sSubSup>
+              <m:e>
+                <m:r>
+                  <m:t>d</m:t>
+                </m:r>
+              </m:e>
+              <m:sub>
+                <m:r>
+                  <m:rPr>
+                    <m:nor/>
+                    <m:sty m:val="p"/>
+                  </m:rPr>
+                  <m:t>in</m:t>
+                </m:r>
+              </m:sub>
+              <m:sup>
+                <m:r>
+                  <m:t>2</m:t>
+                </m:r>
+              </m:sup>
+            </m:sSubSup>
+          </m:e>
+        </m:d>
+      </m:oMath>
+      <w:r>
+        <w:t xml:space="preserve"> </w:t>
+      </w:r>
+      <w:r>
+        <w:t xml:space="preserve">for the accumulation and</w:t>
+      </w:r>
+      <w:r>
+        <w:t xml:space="preserve"> </w:t>
+      </w:r>
+      <m:oMath>
+        <m:r>
+          <m:t>K</m:t>
+        </m:r>
+        <m:r>
+          <m:rPr>
+            <m:sty m:val="p"/>
+          </m:rPr>
+          <m:t>+</m:t>
+        </m:r>
+        <m:r>
+          <m:t>1</m:t>
+        </m:r>
+        <m:r>
+          <m:rPr>
+            <m:sty m:val="p"/>
+          </m:rPr>
+          <m:t>=</m:t>
+        </m:r>
+        <m:r>
+          <m:t>14</m:t>
+        </m:r>
+      </m:oMath>
+      <w:r>
+        <w:t xml:space="preserve"> </w:t>
+      </w:r>
+      <w:r>
+        <w:t xml:space="preserve">solves of cost</w:t>
+      </w:r>
+      <w:r>
+        <w:t xml:space="preserve"> </w:t>
+      </w:r>
+      <m:oMath>
+        <m:r>
+          <m:t>O</m:t>
+        </m:r>
+        <m:d>
+          <m:dPr>
+            <m:begChr m:val="("/>
+            <m:endChr m:val=")"/>
+            <m:sepChr m:val=""/>
+            <m:grow/>
+          </m:dPr>
+          <m:e>
+            <m:sSubSup>
+              <m:e>
+                <m:r>
+                  <m:t>d</m:t>
+                </m:r>
+              </m:e>
+              <m:sub>
+                <m:r>
+                  <m:rPr>
+                    <m:nor/>
+                    <m:sty m:val="p"/>
+                  </m:rPr>
+                  <m:t>in</m:t>
+                </m:r>
+              </m:sub>
+              <m:sup>
+                <m:r>
+                  <m:t>3</m:t>
+                </m:r>
+              </m:sup>
+            </m:sSubSup>
+          </m:e>
+        </m:d>
+      </m:oMath>
+      <w:r>
+        <w:t xml:space="preserve"> </w:t>
+      </w:r>
+      <w:r>
+        <w:t xml:space="preserve">per module, and the cached version makes</w:t>
+      </w:r>
+      <w:r>
+        <w:t xml:space="preserve"> </w:t>
+      </w:r>
+      <m:oMath>
+        <m:r>
+          <m:t>3</m:t>
+        </m:r>
+        <m:r>
+          <m:t>L</m:t>
+        </m:r>
+        <m:r>
+          <m:rPr>
+            <m:sty m:val="p"/>
+          </m:rPr>
+          <m:t>−</m:t>
+        </m:r>
+        <m:r>
+          <m:t>1</m:t>
+        </m:r>
+      </m:oMath>
+      <w:r>
+        <w:t xml:space="preserve"> </w:t>
+      </w:r>
+      <w:r>
+        <w:t xml:space="preserve">passes through a layer per calibration batch. The straightforward implementation instead re-runs both models from the input up to layer</w:t>
+      </w:r>
+      <w:r>
+        <w:t xml:space="preserve"> </w:t>
+      </w:r>
+      <m:oMath>
+        <m:r>
+          <m:t>l</m:t>
+        </m:r>
+      </m:oMath>
+      <w:r>
+        <w:t xml:space="preserve"> </w:t>
+      </w:r>
+      <w:r>
+        <w:t xml:space="preserve">for every</w:t>
+      </w:r>
+      <w:r>
+        <w:t xml:space="preserve"> </w:t>
+      </w:r>
+      <m:oMath>
+        <m:r>
+          <m:t>l</m:t>
+        </m:r>
+      </m:oMath>
+      <w:r>
+        <w:t xml:space="preserve">, which makes</w:t>
+      </w:r>
+      <w:r>
+        <w:t xml:space="preserve"> </w:t>
+      </w:r>
+      <m:oMath>
+        <m:r>
+          <m:t>L</m:t>
+        </m:r>
+        <m:d>
+          <m:dPr>
+            <m:begChr m:val="("/>
+            <m:endChr m:val=")"/>
+            <m:sepChr m:val=""/>
+            <m:grow/>
+          </m:dPr>
+          <m:e>
+            <m:r>
+              <m:t>L</m:t>
+            </m:r>
+            <m:r>
+              <m:rPr>
+                <m:sty m:val="p"/>
+              </m:rPr>
+              <m:t>+</m:t>
+            </m:r>
+            <m:r>
+              <m:t>1</m:t>
+            </m:r>
+          </m:e>
+        </m:d>
+      </m:oMath>
+      <w:r>
+        <w:t xml:space="preserve"> </w:t>
+      </w:r>
+      <w:r>
+        <w:t xml:space="preserve">layer passes per batch, so that the passes grow with</w:t>
+      </w:r>
+      <w:r>
+        <w:t xml:space="preserve"> </w:t>
+      </w:r>
+      <m:oMath>
+        <m:sSup>
+          <m:e>
+            <m:r>
+              <m:t>L</m:t>
+            </m:r>
+          </m:e>
+          <m:sup>
+            <m:r>
+              <m:t>2</m:t>
+            </m:r>
+          </m:sup>
+        </m:sSup>
+      </m:oMath>
+      <w:r>
+        <w:t xml:space="preserve">, whereas one gradient step of retraining passes each layer once and grows with</w:t>
+      </w:r>
+      <w:r>
+        <w:t xml:space="preserve"> </w:t>
+      </w:r>
+      <m:oMath>
+        <m:r>
+          <m:t>L</m:t>
+        </m:r>
+      </m:oMath>
+      <w:r>
+        <w:t xml:space="preserve">. This explains why ACT’s cost relative to retraining rises with depth in the straightforward implementation (Section 7). On random models of three architectures (Llama, Qwen2, GPT-NeoX) and on trained adapters at three sizes, the cached version selected the same</w:t>
+      </w:r>
+      <w:r>
+        <w:t xml:space="preserve"> </w:t>
+      </w:r>
+      <m:oMath>
+        <m:r>
+          <m:t>α</m:t>
+        </m:r>
+      </m:oMath>
+      <w:r>
+        <w:t xml:space="preserve"> </w:t>
+      </w:r>
+      <w:r>
+        <w:t xml:space="preserve">for every module and gave the same held-out loss as the straightforward one.</w:t>
+      </w:r>
+    </w:p>
     <w:bookmarkEnd w:id="24"/>
     <w:bookmarkStart w:id="25" w:name="numerical-analysis"/>
     <w:p>
@@ -17078,7 +17335,7 @@
       <w:pPr>
         <w:numPr>
           <w:ilvl w:val="0"/>
-          <w:numId w:val="1002"/>
+          <w:numId w:val="1003"/>
         </w:numPr>
       </w:pPr>
       <w:r>
@@ -17233,7 +17490,7 @@
       <w:pPr>
         <w:numPr>
           <w:ilvl w:val="0"/>
-          <w:numId w:val="1002"/>
+          <w:numId w:val="1003"/>
         </w:numPr>
       </w:pPr>
       <w:r>
@@ -17339,7 +17596,7 @@
       <w:pPr>
         <w:numPr>
           <w:ilvl w:val="0"/>
-          <w:numId w:val="1002"/>
+          <w:numId w:val="1003"/>
         </w:numPr>
       </w:pPr>
       <w:r>
@@ -17536,7 +17793,7 @@
       <w:pPr>
         <w:numPr>
           <w:ilvl w:val="0"/>
-          <w:numId w:val="1002"/>
+          <w:numId w:val="1003"/>
         </w:numPr>
       </w:pPr>
       <w:r>
@@ -20412,6 +20669,36 @@
     </w:lvlOverride>
   </w:num>
   <w:num w:numId="1002">
+    <w:abstractNumId w:val="99201"/>
+    <w:lvlOverride w:ilvl="0">
+      <w:startOverride w:val="1"/>
+    </w:lvlOverride>
+    <w:lvlOverride w:ilvl="1">
+      <w:startOverride w:val="1"/>
+    </w:lvlOverride>
+    <w:lvlOverride w:ilvl="2">
+      <w:startOverride w:val="1"/>
+    </w:lvlOverride>
+    <w:lvlOverride w:ilvl="3">
+      <w:startOverride w:val="1"/>
+    </w:lvlOverride>
+    <w:lvlOverride w:ilvl="4">
+      <w:startOverride w:val="1"/>
+    </w:lvlOverride>
+    <w:lvlOverride w:ilvl="5">
+      <w:startOverride w:val="1"/>
+    </w:lvlOverride>
+    <w:lvlOverride w:ilvl="6">
+      <w:startOverride w:val="1"/>
+    </w:lvlOverride>
+    <w:lvlOverride w:ilvl="7">
+      <w:startOverride w:val="1"/>
+    </w:lvlOverride>
+    <w:lvlOverride w:ilvl="8">
+      <w:startOverride w:val="1"/>
+    </w:lvlOverride>
+  </w:num>
+  <w:num w:numId="1003">
     <w:abstractNumId w:val="99201"/>
     <w:lvlOverride w:ilvl="0">
       <w:startOverride w:val="1"/>

</xml_diff>